<commit_message>
preserved NA for federal funding lapse.
</commit_message>
<xml_diff>
--- a/output/releases/2026-05_compass_lens.docx
+++ b/output/releases/2026-05_compass_lens.docx
@@ -1,13 +1,13 @@
 
 <file path=word/document.xml><?xml version="1.0" encoding="utf-8"?>
-<w:document xmlns:wpc="http://schemas.microsoft.com/office/word/2010/wordprocessingCanvas" xmlns:cx="http://schemas.microsoft.com/office/drawing/2014/chartex" xmlns:cx1="http://schemas.microsoft.com/office/drawing/2015/9/8/chartex" xmlns:cx2="http://schemas.microsoft.com/office/drawing/2015/10/21/chartex" xmlns:cx3="http://schemas.microsoft.com/office/drawing/2016/5/9/chartex" xmlns:cx4="http://schemas.microsoft.com/office/drawing/2016/5/10/chartex" xmlns:cx5="http://schemas.microsoft.com/office/drawing/2016/5/11/chartex" xmlns:cx6="http://schemas.microsoft.com/office/drawing/2016/5/12/chartex" xmlns:cx7="http://schemas.microsoft.com/office/drawing/2016/5/13/chartex" xmlns:cx8="http://schemas.microsoft.com/office/drawing/2016/5/14/chartex" xmlns:mc="http://schemas.openxmlformats.org/markup-compatibility/2006" xmlns:aink="http://schemas.microsoft.com/office/drawing/2016/ink" xmlns:am3d="http://schemas.microsoft.com/office/drawing/2017/model3d" xmlns:o="urn:schemas-microsoft-com:office:office" xmlns:oel="http://schemas.microsoft.com/office/2019/extlst" xmlns:r="http://schemas.openxmlformats.org/officeDocument/2006/relationships" xmlns:m="http://schemas.openxmlformats.org/officeDocument/2006/math" xmlns:v="urn:schemas-microsoft-com:vml" xmlns:wp14="http://schemas.microsoft.com/office/word/2010/wordprocessingDrawing" xmlns:wp="http://schemas.openxmlformats.org/drawingml/2006/wordprocessingDrawing" xmlns:w10="urn:schemas-microsoft-com:office:word" xmlns:w="http://schemas.openxmlformats.org/wordprocessingml/2006/main" xmlns:w14="http://schemas.microsoft.com/office/word/2010/wordml" xmlns:w15="http://schemas.microsoft.com/office/word/2012/wordml" xmlns:w16cex="http://schemas.microsoft.com/office/word/2018/wordml/cex" xmlns:w16cid="http://schemas.microsoft.com/office/word/2016/wordml/cid" xmlns:w16="http://schemas.microsoft.com/office/word/2018/wordml" xmlns:w16du="http://schemas.microsoft.com/office/word/2023/wordml/word16du" xmlns:w16sdtdh="http://schemas.microsoft.com/office/word/2020/wordml/sdtdatahash" xmlns:w16sdtfl="http://schemas.microsoft.com/office/word/2024/wordml/sdtformatlock" xmlns:w16se="http://schemas.microsoft.com/office/word/2015/wordml/symex" xmlns:wpg="http://schemas.microsoft.com/office/word/2010/wordprocessingGroup" xmlns:wpi="http://schemas.microsoft.com/office/word/2010/wordprocessingInk" xmlns:wne="http://schemas.microsoft.com/office/word/2006/wordml" xmlns:wps="http://schemas.microsoft.com/office/word/2010/wordprocessingShape" mc:Ignorable="w14 w15 w16se w16cid w16 w16cex w16sdtdh w16sdtfl w16du wp14">
+<w:document xmlns:w="http://schemas.openxmlformats.org/wordprocessingml/2006/main" xmlns:m="http://schemas.openxmlformats.org/officeDocument/2006/math" xmlns:r="http://schemas.openxmlformats.org/officeDocument/2006/relationships" xmlns:o="urn:schemas-microsoft-com:office:office" xmlns:v="urn:schemas-microsoft-com:vml" xmlns:w10="urn:schemas-microsoft-com:office:word" xmlns:a="http://schemas.openxmlformats.org/drawingml/2006/main" xmlns:pic="http://schemas.openxmlformats.org/drawingml/2006/picture" xmlns:wp="http://schemas.openxmlformats.org/drawingml/2006/wordprocessingDrawing">
   <w:body>
     <w:p>
       <w:pPr>
         <w:pStyle w:val="Title"/>
       </w:pPr>
       <w:r>
-        <w:t>OWL Corridor Economic Pulse</w:t>
+        <w:t xml:space="preserve">OWL Corridor Economic Pulse</w:t>
       </w:r>
     </w:p>
     <w:p>
@@ -15,7 +15,7 @@
         <w:pStyle w:val="Subtitle"/>
       </w:pPr>
       <w:r>
-        <w:t>Regional Labor Market Analytics &amp; Trend Reports</w:t>
+        <w:t xml:space="preserve">Regional Labor Market Analytics &amp; Trend Reports</w:t>
       </w:r>
     </w:p>
     <w:p>
@@ -23,7 +23,7 @@
         <w:pStyle w:val="Author"/>
       </w:pPr>
       <w:r>
-        <w:t>Great Lakes Center for Economics</w:t>
+        <w:t xml:space="preserve">Great Lakes Center for Economics</w:t>
       </w:r>
     </w:p>
     <w:p>
@@ -31,16 +31,16 @@
         <w:pStyle w:val="Date"/>
       </w:pPr>
       <w:r>
-        <w:t>July 2026</w:t>
-      </w:r>
-    </w:p>
+        <w:t xml:space="preserve">July 2026</w:t>
+      </w:r>
+    </w:p>
+    <w:bookmarkStart w:id="9" w:name="executive-summary"/>
     <w:p>
       <w:pPr>
         <w:pStyle w:val="Heading2"/>
       </w:pPr>
-      <w:bookmarkStart w:id="0" w:name="executive-summary"/>
-      <w:r>
-        <w:t>Executive Summary</w:t>
+      <w:r>
+        <w:t xml:space="preserve">Executive Summary</w:t>
       </w:r>
     </w:p>
     <w:p>
@@ -48,17 +48,23 @@
         <w:pStyle w:val="FirstParagraph"/>
       </w:pPr>
       <w:r>
-        <w:t xml:space="preserve">This regional brief highlights the post-pandemic structural labor market dynamics across the </w:t>
+        <w:t xml:space="preserve">This regional brief highlights the post-pandemic structural labor market dynamics across the</w:t>
+      </w:r>
+      <w:r>
+        <w:t xml:space="preserve"> </w:t>
       </w:r>
       <w:r>
         <w:rPr>
           <w:b/>
           <w:bCs/>
         </w:rPr>
-        <w:t>OWL Corridor</w:t>
-      </w:r>
-      <w:r>
-        <w:t xml:space="preserve"> (Oakland, Washtenaw, and Livingston counties). Utilizing data integrated dynamically via the Local Area Unemployment Statistics (LAUS) program, these metrics reflect localized labor force shifts and regional stability.</w:t>
+        <w:t xml:space="preserve">OWL Corridor</w:t>
+      </w:r>
+      <w:r>
+        <w:t xml:space="preserve"> </w:t>
+      </w:r>
+      <w:r>
+        <w:t xml:space="preserve">(Oakland, Washtenaw, and Livingston counties). Utilizing data integrated dynamically via the Local Area Unemployment Statistics (LAUS) program, these metrics reflect localized labor force shifts and regional stability.</w:t>
       </w:r>
     </w:p>
     <w:p>
@@ -66,42 +72,37 @@
         <w:pStyle w:val="BodyText"/>
       </w:pPr>
       <w:r>
-        <w:t xml:space="preserve">The latest updated metrics in this report reflect data through </w:t>
+        <w:t xml:space="preserve">The latest updated metrics in this report reflect data through</w:t>
+      </w:r>
+      <w:r>
+        <w:t xml:space="preserve"> </w:t>
       </w:r>
       <w:r>
         <w:rPr>
           <w:b/>
           <w:bCs/>
         </w:rPr>
-        <w:t>May 2026</w:t>
-      </w:r>
-      <w:r>
-        <w:t>.</w:t>
-      </w:r>
-    </w:p>
-    <w:p>
-      <w:r>
-        <w:rPr>
-          <w:noProof/>
-        </w:rPr>
-      </w:r>
-      <w:r>
-        <w:rPr>
-          <w:noProof/>
-        </w:rPr>
+        <w:t xml:space="preserve">May 2026</w:t>
+      </w:r>
+      <w:r>
+        <w:t xml:space="preserve">.</w:t>
+      </w:r>
+    </w:p>
+    <w:p>
+      <w:r>
         <w:pict>
-          <v:rect id="_x0000_i1025" alt="" style="width:468pt;height:.05pt;mso-width-percent:0;mso-height-percent:0;mso-width-percent:0;mso-height-percent:0" o:hralign="center" o:hrstd="t" o:hr="t"/>
+          <v:rect style="width:0;height:1.5pt" o:hralign="center" o:hrstd="t" o:hr="t"/>
         </w:pict>
       </w:r>
     </w:p>
+    <w:bookmarkEnd w:id="9"/>
+    <w:bookmarkStart w:id="14" w:name="unemployment-rate-trajectories"/>
     <w:p>
       <w:pPr>
         <w:pStyle w:val="Heading2"/>
       </w:pPr>
-      <w:bookmarkStart w:id="1" w:name="unemployment-rate-trajectories"/>
-      <w:bookmarkEnd w:id="0"/>
-      <w:r>
-        <w:t>Unemployment Rate Trajectories</w:t>
+      <w:r>
+        <w:t xml:space="preserve">Unemployment Rate Trajectories</w:t>
       </w:r>
     </w:p>
     <w:p>
@@ -109,7 +110,7 @@
         <w:pStyle w:val="FirstParagraph"/>
       </w:pPr>
       <w:r>
-        <w:t>The chart below outlines the structural normalization of the regional unemployment rate. The green line establishes the baseline for Oakland County, while Navy and Orange represent Washtenaw and Livingston Counties respectively.</w:t>
+        <w:t xml:space="preserve">The chart below outlines the structural normalization of the regional unemployment rate. The green line establishes the baseline for Oakland County, while Navy and Orange represent Washtenaw and Livingston Counties respectively.</w:t>
       </w:r>
     </w:p>
     <w:p>
@@ -117,51 +118,45 @@
         <w:pStyle w:val="Heading3"/>
       </w:pPr>
       <w:r>
-        <w:t>Unemployment Visualization</w:t>
+        <w:t xml:space="preserve">Unemployment Visualization</w:t>
       </w:r>
     </w:p>
     <w:tbl>
       <w:tblPr>
         <w:tblStyle w:val="Table"/>
-        <w:tblW w:w="5000" w:type="pct"/>
+        <w:tblW w:type="pct" w:w="5000"/>
         <w:tblLayout w:type="fixed"/>
-        <w:tblLook w:val="0000" w:firstRow="0" w:lastRow="0" w:firstColumn="0" w:lastColumn="0" w:noHBand="0" w:noVBand="0"/>
+        <w:tblLook w:firstRow="0" w:lastRow="0" w:firstColumn="0" w:lastColumn="0" w:noHBand="0" w:noVBand="0" w:val="0000"/>
       </w:tblPr>
       <w:tblGrid>
-        <w:gridCol w:w="9576"/>
+        <w:gridCol w:w="7920"/>
       </w:tblGrid>
       <w:tr>
         <w:tc>
-          <w:tcPr>
-            <w:tcW w:w="7920" w:type="dxa"/>
-          </w:tcPr>
+          <w:tcPr/>
+          <w:bookmarkStart w:id="13" w:name="fig-unemployment"/>
           <w:p>
             <w:pPr>
               <w:pStyle w:val="Compact"/>
               <w:jc w:val="center"/>
             </w:pPr>
-            <w:bookmarkStart w:id="2" w:name="fig-unemployment"/>
             <w:r>
-              <w:rPr>
-                <w:noProof/>
-              </w:rPr>
               <w:drawing>
-                <wp:inline distT="0" distB="0" distL="0" distR="0">
+                <wp:inline>
                   <wp:extent cx="5334000" cy="3000374"/>
-                  <wp:effectExtent l="0" t="0" r="0" b="0"/>
-                  <wp:docPr id="11" name="Picture"/>
-                  <wp:cNvGraphicFramePr/>
-                  <a:graphic xmlns:a="http://schemas.openxmlformats.org/drawingml/2006/main">
+                  <wp:effectExtent b="0" l="0" r="0" t="0"/>
+                  <wp:docPr descr="" title="" id="11" name="Picture"/>
+                  <a:graphic>
                     <a:graphicData uri="http://schemas.openxmlformats.org/drawingml/2006/picture">
-                      <pic:pic xmlns:pic="http://schemas.openxmlformats.org/drawingml/2006/picture">
+                      <pic:pic>
                         <pic:nvPicPr>
-                          <pic:cNvPr id="12" name="Picture" descr="../plots/laus_unemployment_rates.png"/>
+                          <pic:cNvPr descr="../plots/laus_unemployment_rates.png" id="12" name="Picture"/>
                           <pic:cNvPicPr>
-                            <a:picLocks noChangeAspect="1" noChangeArrowheads="1"/>
+                            <a:picLocks noChangeArrowheads="1" noChangeAspect="1"/>
                           </pic:cNvPicPr>
                         </pic:nvPicPr>
                         <pic:blipFill>
-                          <a:blip r:embed="rId5"/>
+                          <a:blip r:embed="rId10"/>
                           <a:stretch>
                             <a:fillRect/>
                           </a:stretch>
@@ -190,15 +185,19 @@
           </w:p>
           <w:p>
             <w:pPr>
+              <w:jc w:val="center"/>
+            </w:pPr>
+            <w:pPr>
+              <w:jc w:val="left"/>
+              <w:spacing w:before="200"/>
               <w:pStyle w:val="ImageCaption"/>
-              <w:spacing w:before="200"/>
             </w:pPr>
             <w:r>
-              <w:t>Figure 1: Unemployment Rate Horizon: Post-pandemic normalization across the OWL Corridor.</w:t>
+              <w:t xml:space="preserve">Figure 1: Unemployment Rate Horizon: Post-pandemic normalization across the OWL Corridor.</w:t>
             </w:r>
           </w:p>
+          <w:bookmarkEnd w:id="13"/>
         </w:tc>
-        <w:bookmarkEnd w:id="2"/>
       </w:tr>
     </w:tbl>
     <w:p>
@@ -206,8 +205,7 @@
         <w:pStyle w:val="Heading3"/>
       </w:pPr>
       <w:r>
-        <w:lastRenderedPageBreak/>
-        <w:t>Core Unemployment Takeaways</w:t>
+        <w:t xml:space="preserve">Core Unemployment Takeaways</w:t>
       </w:r>
     </w:p>
     <w:p>
@@ -215,7 +213,7 @@
         <w:pStyle w:val="Compact"/>
         <w:numPr>
           <w:ilvl w:val="0"/>
-          <w:numId w:val="2"/>
+          <w:numId w:val="1001"/>
         </w:numPr>
       </w:pPr>
       <w:r>
@@ -223,10 +221,13 @@
           <w:b/>
           <w:bCs/>
         </w:rPr>
-        <w:t>Structural Stabilization:</w:t>
-      </w:r>
-      <w:r>
-        <w:t xml:space="preserve"> Regional unemployment rates continue to trend near historical baselines, moving out of post-pandemic fluctuations into long-term equilibrium.</w:t>
+        <w:t xml:space="preserve">Structural Stabilization:</w:t>
+      </w:r>
+      <w:r>
+        <w:t xml:space="preserve"> </w:t>
+      </w:r>
+      <w:r>
+        <w:t xml:space="preserve">Regional unemployment rates continue to trend near historical baselines, moving out of post-pandemic fluctuations into long-term equilibrium.</w:t>
       </w:r>
     </w:p>
     <w:p>
@@ -234,7 +235,7 @@
         <w:pStyle w:val="Compact"/>
         <w:numPr>
           <w:ilvl w:val="0"/>
-          <w:numId w:val="2"/>
+          <w:numId w:val="1001"/>
         </w:numPr>
       </w:pPr>
       <w:r>
@@ -242,35 +243,30 @@
           <w:b/>
           <w:bCs/>
         </w:rPr>
-        <w:t>Corridor Alignment:</w:t>
-      </w:r>
-      <w:r>
-        <w:t xml:space="preserve"> The tight distribution among the three primary counties highlights deep economic integration within the regional transit and employment corridors.</w:t>
-      </w:r>
-    </w:p>
-    <w:p>
-      <w:r>
-        <w:rPr>
-          <w:noProof/>
-        </w:rPr>
-      </w:r>
-      <w:r>
-        <w:rPr>
-          <w:noProof/>
-        </w:rPr>
+        <w:t xml:space="preserve">Corridor Alignment:</w:t>
+      </w:r>
+      <w:r>
+        <w:t xml:space="preserve"> </w:t>
+      </w:r>
+      <w:r>
+        <w:t xml:space="preserve">The tight distribution among the three primary counties highlights deep economic integration within the regional transit and employment corridors.</w:t>
+      </w:r>
+    </w:p>
+    <w:p>
+      <w:r>
         <w:pict>
-          <v:rect id="_x0000_i1026" alt="" style="width:468pt;height:.05pt;mso-width-percent:0;mso-height-percent:0;mso-width-percent:0;mso-height-percent:0" o:hralign="center" o:hrstd="t" o:hr="t"/>
+          <v:rect style="width:0;height:1.5pt" o:hralign="center" o:hrstd="t" o:hr="t"/>
         </w:pict>
       </w:r>
     </w:p>
+    <w:bookmarkEnd w:id="14"/>
+    <w:bookmarkStart w:id="19" w:name="labor-force-capacity-growth-scales"/>
     <w:p>
       <w:pPr>
         <w:pStyle w:val="Heading2"/>
       </w:pPr>
-      <w:bookmarkStart w:id="3" w:name="labor-force-capacity-growth-scales"/>
-      <w:bookmarkEnd w:id="1"/>
-      <w:r>
-        <w:t>Labor Force Capacity &amp; Growth Scales</w:t>
+      <w:r>
+        <w:t xml:space="preserve">Labor Force Capacity &amp; Growth Scales</w:t>
       </w:r>
     </w:p>
     <w:p>
@@ -278,17 +274,20 @@
         <w:pStyle w:val="FirstParagraph"/>
       </w:pPr>
       <w:r>
-        <w:t xml:space="preserve">To observe true relative resource scaling, local labor supply capacities are indexed to a baseline of </w:t>
+        <w:t xml:space="preserve">To observe true relative resource scaling, local labor supply capacities are indexed to a baseline of</w:t>
+      </w:r>
+      <w:r>
+        <w:t xml:space="preserve"> </w:t>
       </w:r>
       <w:r>
         <w:rPr>
           <w:b/>
           <w:bCs/>
         </w:rPr>
-        <w:t>January 2022 = 100</w:t>
-      </w:r>
-      <w:r>
-        <w:t>. This removes pure absolute scale differences (such as Oakland’s larger raw population) to trace true expansion velocities.</w:t>
+        <w:t xml:space="preserve">January 2022 = 100</w:t>
+      </w:r>
+      <w:r>
+        <w:t xml:space="preserve">. This removes pure absolute scale differences (such as Oakland’s larger raw population) to trace true expansion velocities.</w:t>
       </w:r>
     </w:p>
     <w:p>
@@ -296,51 +295,45 @@
         <w:pStyle w:val="Heading3"/>
       </w:pPr>
       <w:r>
-        <w:t>Labor Force Visualization</w:t>
+        <w:t xml:space="preserve">Labor Force Visualization</w:t>
       </w:r>
     </w:p>
     <w:tbl>
       <w:tblPr>
         <w:tblStyle w:val="Table"/>
-        <w:tblW w:w="5000" w:type="pct"/>
+        <w:tblW w:type="pct" w:w="5000"/>
         <w:tblLayout w:type="fixed"/>
-        <w:tblLook w:val="0000" w:firstRow="0" w:lastRow="0" w:firstColumn="0" w:lastColumn="0" w:noHBand="0" w:noVBand="0"/>
+        <w:tblLook w:firstRow="0" w:lastRow="0" w:firstColumn="0" w:lastColumn="0" w:noHBand="0" w:noVBand="0" w:val="0000"/>
       </w:tblPr>
       <w:tblGrid>
-        <w:gridCol w:w="9576"/>
+        <w:gridCol w:w="7920"/>
       </w:tblGrid>
       <w:tr>
         <w:tc>
-          <w:tcPr>
-            <w:tcW w:w="7920" w:type="dxa"/>
-          </w:tcPr>
+          <w:tcPr/>
+          <w:bookmarkStart w:id="18" w:name="fig-laborforce"/>
           <w:p>
             <w:pPr>
               <w:pStyle w:val="Compact"/>
               <w:jc w:val="center"/>
             </w:pPr>
-            <w:bookmarkStart w:id="4" w:name="fig-laborforce"/>
             <w:r>
-              <w:rPr>
-                <w:noProof/>
-              </w:rPr>
               <w:drawing>
-                <wp:inline distT="0" distB="0" distL="0" distR="0">
+                <wp:inline>
                   <wp:extent cx="5334000" cy="3000374"/>
-                  <wp:effectExtent l="0" t="0" r="0" b="0"/>
-                  <wp:docPr id="16" name="Picture"/>
-                  <wp:cNvGraphicFramePr/>
-                  <a:graphic xmlns:a="http://schemas.openxmlformats.org/drawingml/2006/main">
+                  <wp:effectExtent b="0" l="0" r="0" t="0"/>
+                  <wp:docPr descr="" title="" id="16" name="Picture"/>
+                  <a:graphic>
                     <a:graphicData uri="http://schemas.openxmlformats.org/drawingml/2006/picture">
-                      <pic:pic xmlns:pic="http://schemas.openxmlformats.org/drawingml/2006/picture">
+                      <pic:pic>
                         <pic:nvPicPr>
-                          <pic:cNvPr id="17" name="Picture" descr="../plots/laus_labor_force_indexed.png"/>
+                          <pic:cNvPr descr="../plots/laus_labor_force_indexed.png" id="17" name="Picture"/>
                           <pic:cNvPicPr>
-                            <a:picLocks noChangeAspect="1" noChangeArrowheads="1"/>
+                            <a:picLocks noChangeArrowheads="1" noChangeAspect="1"/>
                           </pic:cNvPicPr>
                         </pic:nvPicPr>
                         <pic:blipFill>
-                          <a:blip r:embed="rId6"/>
+                          <a:blip r:embed="rId15"/>
                           <a:stretch>
                             <a:fillRect/>
                           </a:stretch>
@@ -369,15 +362,19 @@
           </w:p>
           <w:p>
             <w:pPr>
+              <w:jc w:val="center"/>
+            </w:pPr>
+            <w:pPr>
+              <w:jc w:val="left"/>
+              <w:spacing w:before="200"/>
               <w:pStyle w:val="ImageCaption"/>
-              <w:spacing w:before="200"/>
             </w:pPr>
             <w:r>
-              <w:t>Figure 2: Labor Force Capacity: Indexed growth trends relative to the January 2022 baseline.</w:t>
+              <w:t xml:space="preserve">Figure 2: Labor Force Capacity: Indexed growth trends relative to the January 2022 baseline.</w:t>
             </w:r>
           </w:p>
+          <w:bookmarkEnd w:id="18"/>
         </w:tc>
-        <w:bookmarkEnd w:id="4"/>
       </w:tr>
     </w:tbl>
     <w:p>
@@ -385,7 +382,7 @@
         <w:pStyle w:val="Heading3"/>
       </w:pPr>
       <w:r>
-        <w:t>Core Labor Force Takeaways</w:t>
+        <w:t xml:space="preserve">Core Labor Force Takeaways</w:t>
       </w:r>
     </w:p>
     <w:p>
@@ -393,7 +390,7 @@
         <w:pStyle w:val="Compact"/>
         <w:numPr>
           <w:ilvl w:val="0"/>
-          <w:numId w:val="3"/>
+          <w:numId w:val="1002"/>
         </w:numPr>
       </w:pPr>
       <w:r>
@@ -401,10 +398,13 @@
           <w:b/>
           <w:bCs/>
         </w:rPr>
-        <w:t>Indexed Growth:</w:t>
-      </w:r>
-      <w:r>
-        <w:t xml:space="preserve"> All three counties have experienced a net expansion in labor force capacity since January 2022, with Washtenaw County displaying a distinct trajectory relative to the rest of the corridor.</w:t>
+        <w:t xml:space="preserve">Indexed Growth:</w:t>
+      </w:r>
+      <w:r>
+        <w:t xml:space="preserve"> </w:t>
+      </w:r>
+      <w:r>
+        <w:t xml:space="preserve">All three counties have experienced a net expansion in labor force capacity since January 2022, with Washtenaw County displaying a distinct trajectory relative to the rest of the corridor.</w:t>
       </w:r>
     </w:p>
     <w:p>
@@ -412,7 +412,7 @@
         <w:pStyle w:val="Compact"/>
         <w:numPr>
           <w:ilvl w:val="0"/>
-          <w:numId w:val="3"/>
+          <w:numId w:val="1002"/>
         </w:numPr>
       </w:pPr>
       <w:r>
@@ -420,14 +420,13 @@
           <w:b/>
           <w:bCs/>
         </w:rPr>
-        <w:t>Relative Velocity:</w:t>
-      </w:r>
-      <w:r>
-        <w:t xml:space="preserve"> Washtenaw County’s labor force growth has outpaced the other counties up until Septemer 2025 when it experienced a downturn. Estimates in May </w:t>
-      </w:r>
-      <w:r>
-        <w:lastRenderedPageBreak/>
-        <w:t>2026 shows the labor force has increased marginally and resumes tracking the progress in neighboring counties in the OWL Corridor.</w:t>
+        <w:t xml:space="preserve">Relative Velocity:</w:t>
+      </w:r>
+      <w:r>
+        <w:t xml:space="preserve"> </w:t>
+      </w:r>
+      <w:r>
+        <w:t xml:space="preserve">Washtenaw County’s labor force growth has outpaced the other counties up until Septemer 2025 when it experienced a downturn. Estimates in May 2026 shows the labor force has increased marginally and resumes tracking the progress in neighboring counties in the OWL Corridor.</w:t>
       </w:r>
     </w:p>
     <w:p>
@@ -439,24 +438,19 @@
           <w:b/>
           <w:bCs/>
         </w:rPr>
-        <w:t>Methodological Note:</w:t>
-      </w:r>
-      <w:r>
-        <w:t xml:space="preserve"> An indexed baseline of 100 means a metric value of 104 represents a clean 4% expansion in the total available labor supply pool since January 2022, regardless of raw population counts.</w:t>
-      </w:r>
-    </w:p>
-    <w:p>
-      <w:r>
-        <w:rPr>
-          <w:noProof/>
-        </w:rPr>
-      </w:r>
-      <w:r>
-        <w:rPr>
-          <w:noProof/>
-        </w:rPr>
+        <w:t xml:space="preserve">Methodological Note:</w:t>
+      </w:r>
+      <w:r>
+        <w:t xml:space="preserve"> </w:t>
+      </w:r>
+      <w:r>
+        <w:t xml:space="preserve">An indexed baseline of 100 means a metric value of 104 represents a clean 4% expansion in the total available labor supply pool since January 2022, regardless of raw population counts.</w:t>
+      </w:r>
+    </w:p>
+    <w:p>
+      <w:r>
         <w:pict>
-          <v:rect id="_x0000_i1027" alt="" style="width:468pt;height:.05pt;mso-width-percent:0;mso-height-percent:0;mso-width-percent:0;mso-height-percent:0" o:hralign="center" o:hrstd="t" o:hr="t"/>
+          <v:rect style="width:0;height:1.5pt" o:hralign="center" o:hrstd="t" o:hr="t"/>
         </w:pict>
       </w:r>
     </w:p>
@@ -469,7 +463,7 @@
           <w:b/>
           <w:bCs/>
         </w:rPr>
-        <w:t>Data Note:</w:t>
+        <w:t xml:space="preserve">Data Note:</w:t>
       </w:r>
       <w:r>
         <w:t xml:space="preserve"> </w:t>
@@ -479,78 +473,48 @@
           <w:i/>
           <w:iCs/>
         </w:rPr>
-        <w:t xml:space="preserve">Metrics reflect official LAUS/BLS benchmarks as of July 25, 2026. Historical series incorporate all revised estimates released through May 2026. In October 2025, a </w:t>
+        <w:t xml:space="preserve">Metrics reflect official LAUS/BLS benchmarks as of July 25, 2026. Historical series incorporate all revised estimates released through May 2026. In October 2025, a lapse in federal funding prohibited the collection of LAUS data. There is no LAUS data for October 2025.</w:t>
+      </w:r>
+    </w:p>
+    <w:p>
+      <w:r>
+        <w:pict>
+          <v:rect style="width:0;height:1.5pt" o:hralign="center" o:hrstd="t" o:hr="t"/>
+        </w:pict>
+      </w:r>
+    </w:p>
+    <w:bookmarkEnd w:id="19"/>
+    <w:bookmarkStart w:id="20" w:name="data-provenance-reliability"/>
+    <w:p>
+      <w:pPr>
+        <w:pStyle w:val="Heading2"/>
+      </w:pPr>
+      <w:r>
+        <w:t xml:space="preserve">Data Provenance &amp; Reliability</w:t>
+      </w:r>
+    </w:p>
+    <w:p>
+      <w:pPr>
+        <w:pStyle w:val="FirstParagraph"/>
+      </w:pPr>
+      <w:r>
+        <w:t xml:space="preserve">Data streams are ingested directly from primary federal and state reporting nodes. Technical calculations, data processing, and visualization builds are automated programmatically by</w:t>
+      </w:r>
+      <w:r>
+        <w:t xml:space="preserve"> </w:t>
       </w:r>
       <w:r>
         <w:rPr>
           <w:i/>
           <w:iCs/>
         </w:rPr>
-        <w:t xml:space="preserve">lapse in </w:t>
-      </w:r>
-      <w:r>
-        <w:rPr>
-          <w:i/>
-          <w:iCs/>
-        </w:rPr>
-        <w:t xml:space="preserve">federal </w:t>
-      </w:r>
-      <w:r>
-        <w:rPr>
-          <w:i/>
-          <w:iCs/>
-        </w:rPr>
-        <w:t>funding</w:t>
-      </w:r>
-      <w:r>
-        <w:rPr>
-          <w:i/>
-          <w:iCs/>
-        </w:rPr>
-        <w:t xml:space="preserve"> prohibited the collection of LAUS data. There is no LAUS data for October 2025.</w:t>
-      </w:r>
-    </w:p>
-    <w:p>
-      <w:r>
-        <w:rPr>
-          <w:noProof/>
-        </w:rPr>
-      </w:r>
-      <w:r>
-        <w:rPr>
-          <w:noProof/>
-        </w:rPr>
-        <w:pict>
-          <v:rect id="_x0000_i1028" alt="" style="width:468pt;height:.05pt;mso-width-percent:0;mso-height-percent:0;mso-width-percent:0;mso-height-percent:0" o:hralign="center" o:hrstd="t" o:hr="t"/>
-        </w:pict>
-      </w:r>
-    </w:p>
-    <w:p>
-      <w:pPr>
-        <w:pStyle w:val="Heading2"/>
-      </w:pPr>
-      <w:bookmarkStart w:id="5" w:name="data-provenance-reliability"/>
-      <w:bookmarkEnd w:id="3"/>
-      <w:r>
-        <w:t>Data Provenance &amp; Reliability</w:t>
-      </w:r>
-    </w:p>
-    <w:p>
-      <w:pPr>
-        <w:pStyle w:val="FirstParagraph"/>
-      </w:pPr>
-      <w:r>
-        <w:t xml:space="preserve">Data streams are ingested directly from primary federal and state reporting nodes. Technical calculations, data processing, and visualization builds are automated programmatically by </w:t>
-      </w:r>
-      <w:r>
-        <w:rPr>
-          <w:i/>
-          <w:iCs/>
-        </w:rPr>
-        <w:t>The Compass Lens</w:t>
-      </w:r>
-      <w:r>
-        <w:t xml:space="preserve"> core data architecture to eliminate transcription vulnerabilities.</w:t>
+        <w:t xml:space="preserve">The Compass Lens</w:t>
+      </w:r>
+      <w:r>
+        <w:t xml:space="preserve"> </w:t>
+      </w:r>
+      <w:r>
+        <w:t xml:space="preserve">core data architecture to eliminate transcription vulnerabilities.</w:t>
       </w:r>
     </w:p>
     <w:p>
@@ -558,85 +522,74 @@
         <w:pStyle w:val="BodyText"/>
       </w:pPr>
       <w:r>
-        <w:t>All data, analysis, and views presented herein are independent work products of Great Lakes Center for Economics.</w:t>
+        <w:t xml:space="preserve">All data, analysis, and views presented herein are independent work products of Great Lakes Center for Economics.</w:t>
       </w:r>
     </w:p>
     <w:tbl>
       <w:tblPr>
         <w:tblStyle w:val="Table"/>
-        <w:tblW w:w="5000" w:type="pct"/>
+        <w:tblW w:type="pct" w:w="5000"/>
         <w:tblLayout w:type="fixed"/>
-        <w:tblLook w:val="0020" w:firstRow="1" w:lastRow="0" w:firstColumn="0" w:lastColumn="0" w:noHBand="0" w:noVBand="0"/>
+        <w:tblLook w:firstRow="1" w:lastRow="0" w:firstColumn="0" w:lastColumn="0" w:noHBand="0" w:noVBand="0" w:val="0020"/>
       </w:tblPr>
       <w:tblGrid>
-        <w:gridCol w:w="2394"/>
-        <w:gridCol w:w="2394"/>
-        <w:gridCol w:w="2394"/>
-        <w:gridCol w:w="2394"/>
+        <w:gridCol w:w="1980"/>
+        <w:gridCol w:w="1980"/>
+        <w:gridCol w:w="1980"/>
+        <w:gridCol w:w="1980"/>
       </w:tblGrid>
       <w:tr>
         <w:trPr>
-          <w:cnfStyle w:val="100000000000" w:firstRow="1" w:lastRow="0" w:firstColumn="0" w:lastColumn="0" w:oddVBand="0" w:evenVBand="0" w:oddHBand="0" w:evenHBand="0" w:firstRowFirstColumn="0" w:firstRowLastColumn="0" w:lastRowFirstColumn="0" w:lastRowLastColumn="0"/>
-          <w:tblHeader/>
+          <w:tblHeader w:val="on"/>
         </w:trPr>
         <w:tc>
-          <w:tcPr>
-            <w:tcW w:w="1980" w:type="dxa"/>
-          </w:tcPr>
+          <w:tcPr/>
           <w:p>
             <w:pPr>
               <w:pStyle w:val="Compact"/>
             </w:pPr>
             <w:r>
-              <w:t>Metric Component</w:t>
+              <w:t xml:space="preserve">Metric Component</w:t>
             </w:r>
           </w:p>
         </w:tc>
         <w:tc>
-          <w:tcPr>
-            <w:tcW w:w="1980" w:type="dxa"/>
-          </w:tcPr>
+          <w:tcPr/>
           <w:p>
             <w:pPr>
               <w:pStyle w:val="Compact"/>
             </w:pPr>
             <w:r>
-              <w:t>Primary Source Agency</w:t>
+              <w:t xml:space="preserve">Primary Source Agency</w:t>
             </w:r>
           </w:p>
         </w:tc>
         <w:tc>
-          <w:tcPr>
-            <w:tcW w:w="1980" w:type="dxa"/>
-          </w:tcPr>
+          <w:tcPr/>
           <w:p>
             <w:pPr>
               <w:pStyle w:val="Compact"/>
             </w:pPr>
             <w:r>
-              <w:t>Spatial Resolution</w:t>
+              <w:t xml:space="preserve">Spatial Resolution</w:t>
             </w:r>
           </w:p>
         </w:tc>
         <w:tc>
-          <w:tcPr>
-            <w:tcW w:w="1980" w:type="dxa"/>
-          </w:tcPr>
+          <w:tcPr/>
           <w:p>
             <w:pPr>
               <w:pStyle w:val="Compact"/>
             </w:pPr>
             <w:r>
-              <w:t>Update Cadence</w:t>
+              <w:t xml:space="preserve">Update Cadence</w:t>
             </w:r>
           </w:p>
         </w:tc>
       </w:tr>
       <w:tr>
         <w:tc>
-          <w:tcPr>
-            <w:tcW w:w="1980" w:type="dxa"/>
-          </w:tcPr>
+          <w:tcPr/>
           <w:p>
             <w:pPr>
               <w:pStyle w:val="Compact"/>
@@ -646,71 +599,133 @@
                 <w:b/>
                 <w:bCs/>
               </w:rPr>
-              <w:t>Local Area Unemployment</w:t>
+              <w:t xml:space="preserve">Local Area Unemployment</w:t>
             </w:r>
           </w:p>
         </w:tc>
         <w:tc>
-          <w:tcPr>
-            <w:tcW w:w="1980" w:type="dxa"/>
-          </w:tcPr>
+          <w:tcPr/>
           <w:p>
             <w:pPr>
               <w:pStyle w:val="Compact"/>
             </w:pPr>
             <w:r>
-              <w:t>Bureau of Labor Statistics (LAUS)</w:t>
+              <w:t xml:space="preserve">Bureau of Labor Statistics (LAUS)</w:t>
             </w:r>
           </w:p>
         </w:tc>
         <w:tc>
-          <w:tcPr>
-            <w:tcW w:w="1980" w:type="dxa"/>
-          </w:tcPr>
+          <w:tcPr/>
           <w:p>
             <w:pPr>
               <w:pStyle w:val="Compact"/>
             </w:pPr>
             <w:r>
-              <w:t>County Level</w:t>
+              <w:t xml:space="preserve">County Level</w:t>
             </w:r>
           </w:p>
         </w:tc>
         <w:tc>
-          <w:tcPr>
-            <w:tcW w:w="1980" w:type="dxa"/>
-          </w:tcPr>
+          <w:tcPr/>
           <w:p>
             <w:pPr>
               <w:pStyle w:val="Compact"/>
             </w:pPr>
             <w:r>
-              <w:t>Monthly</w:t>
+              <w:t xml:space="preserve">Monthly</w:t>
             </w:r>
           </w:p>
         </w:tc>
       </w:tr>
-      <w:bookmarkEnd w:id="5"/>
+      <w:tr>
+        <w:tc>
+          <w:tcPr/>
+          <w:p>
+            <w:pPr>
+              <w:pStyle w:val="Compact"/>
+            </w:pPr>
+            <w:r>
+              <w:rPr>
+                <w:b/>
+                <w:bCs/>
+              </w:rPr>
+              <w:t xml:space="preserve">Consumer Sentiment</w:t>
+            </w:r>
+          </w:p>
+        </w:tc>
+        <w:tc>
+          <w:tcPr/>
+          <w:p>
+            <w:pPr>
+              <w:pStyle w:val="Compact"/>
+            </w:pPr>
+            <w:r>
+              <w:t xml:space="preserve">University of Michigan</w:t>
+            </w:r>
+          </w:p>
+        </w:tc>
+        <w:tc>
+          <w:tcPr/>
+          <w:p>
+            <w:pPr>
+              <w:pStyle w:val="Compact"/>
+            </w:pPr>
+            <w:r>
+              <w:t xml:space="preserve">National Baseline</w:t>
+            </w:r>
+          </w:p>
+        </w:tc>
+        <w:tc>
+          <w:tcPr/>
+          <w:p>
+            <w:pPr>
+              <w:pStyle w:val="Compact"/>
+            </w:pPr>
+            <w:r>
+              <w:t xml:space="preserve">Monthly</w:t>
+            </w:r>
+          </w:p>
+        </w:tc>
+      </w:tr>
     </w:tbl>
-    <w:p/>
+    <w:bookmarkEnd w:id="20"/>
     <w:sectPr>
       <w:footnotePr>
         <w:numRestart w:val="eachSect"/>
       </w:footnotePr>
-      <w:pgSz w:w="12240" w:h="15840"/>
-      <w:pgMar w:top="1440" w:right="1440" w:bottom="1440" w:left="1440" w:header="720" w:footer="720" w:gutter="0"/>
-      <w:cols w:space="720"/>
     </w:sectPr>
   </w:body>
 </w:document>
 </file>
 
+<file path=word/comments.xml><?xml version="1.0" encoding="utf-8"?>
+<w:comments xmlns:w="http://schemas.openxmlformats.org/wordprocessingml/2006/main" xmlns:m="http://schemas.openxmlformats.org/officeDocument/2006/math" xmlns:r="http://schemas.openxmlformats.org/officeDocument/2006/relationships" xmlns:o="urn:schemas-microsoft-com:office:office" xmlns:v="urn:schemas-microsoft-com:vml" xmlns:w10="urn:schemas-microsoft-com:office:word" xmlns:a="http://schemas.openxmlformats.org/drawingml/2006/main" xmlns:pic="http://schemas.openxmlformats.org/drawingml/2006/picture" xmlns:wp="http://schemas.openxmlformats.org/drawingml/2006/wordprocessingDrawing"/>
+</file>
+
+<file path=word/footnotes.xml><?xml version="1.0" encoding="utf-8"?>
+<w:footnotes xmlns:w="http://schemas.openxmlformats.org/wordprocessingml/2006/main" xmlns:m="http://schemas.openxmlformats.org/officeDocument/2006/math" xmlns:r="http://schemas.openxmlformats.org/officeDocument/2006/relationships" xmlns:o="urn:schemas-microsoft-com:office:office" xmlns:v="urn:schemas-microsoft-com:vml" xmlns:w10="urn:schemas-microsoft-com:office:word" xmlns:a="http://schemas.openxmlformats.org/drawingml/2006/main" xmlns:pic="http://schemas.openxmlformats.org/drawingml/2006/picture" xmlns:wp="http://schemas.openxmlformats.org/drawingml/2006/wordprocessingDrawing">
+  <w:footnote w:type="continuationSeparator" w:id="0">
+    <w:p>
+      <w:r>
+        <w:continuationSeparator/>
+      </w:r>
+    </w:p>
+  </w:footnote>
+  <w:footnote w:type="separator" w:id="-1">
+    <w:p>
+      <w:r>
+        <w:separator/>
+      </w:r>
+    </w:p>
+  </w:footnote>
+</w:footnotes>
+</file>
+
 <file path=word/numbering.xml><?xml version="1.0" encoding="utf-8"?>
-<w:numbering xmlns:wpc="http://schemas.microsoft.com/office/word/2010/wordprocessingCanvas" xmlns:cx="http://schemas.microsoft.com/office/drawing/2014/chartex" xmlns:cx1="http://schemas.microsoft.com/office/drawing/2015/9/8/chartex" xmlns:cx2="http://schemas.microsoft.com/office/drawing/2015/10/21/chartex" xmlns:cx3="http://schemas.microsoft.com/office/drawing/2016/5/9/chartex" xmlns:cx4="http://schemas.microsoft.com/office/drawing/2016/5/10/chartex" xmlns:cx5="http://schemas.microsoft.com/office/drawing/2016/5/11/chartex" xmlns:cx6="http://schemas.microsoft.com/office/drawing/2016/5/12/chartex" xmlns:cx7="http://schemas.microsoft.com/office/drawing/2016/5/13/chartex" xmlns:cx8="http://schemas.microsoft.com/office/drawing/2016/5/14/chartex" xmlns:mc="http://schemas.openxmlformats.org/markup-compatibility/2006" xmlns:aink="http://schemas.microsoft.com/office/drawing/2016/ink" xmlns:am3d="http://schemas.microsoft.com/office/drawing/2017/model3d" xmlns:o="urn:schemas-microsoft-com:office:office" xmlns:oel="http://schemas.microsoft.com/office/2019/extlst" xmlns:r="http://schemas.openxmlformats.org/officeDocument/2006/relationships" xmlns:m="http://schemas.openxmlformats.org/officeDocument/2006/math" xmlns:v="urn:schemas-microsoft-com:vml" xmlns:wp14="http://schemas.microsoft.com/office/word/2010/wordprocessingDrawing" xmlns:wp="http://schemas.openxmlformats.org/drawingml/2006/wordprocessingDrawing" xmlns:w10="urn:schemas-microsoft-com:office:word" xmlns:w="http://schemas.openxmlformats.org/wordprocessingml/2006/main" xmlns:w14="http://schemas.microsoft.com/office/word/2010/wordml" xmlns:w15="http://schemas.microsoft.com/office/word/2012/wordml" xmlns:w16cex="http://schemas.microsoft.com/office/word/2018/wordml/cex" xmlns:w16cid="http://schemas.microsoft.com/office/word/2016/wordml/cid" xmlns:w16="http://schemas.microsoft.com/office/word/2018/wordml" xmlns:w16du="http://schemas.microsoft.com/office/word/2023/wordml/word16du" xmlns:w16sdtdh="http://schemas.microsoft.com/office/word/2020/wordml/sdtdatahash" xmlns:w16sdtfl="http://schemas.microsoft.com/office/word/2024/wordml/sdtformatlock" xmlns:w16se="http://schemas.microsoft.com/office/word/2015/wordml/symex" xmlns:wpg="http://schemas.microsoft.com/office/word/2010/wordprocessingGroup" xmlns:wpi="http://schemas.microsoft.com/office/word/2010/wordprocessingInk" xmlns:wne="http://schemas.microsoft.com/office/word/2006/wordml" xmlns:wps="http://schemas.microsoft.com/office/word/2010/wordprocessingShape" mc:Ignorable="w14 w15 w16se w16cid w16 w16cex w16sdtdh w16sdtfl w16du wp14">
-  <w:abstractNum w:abstractNumId="0" w15:restartNumberingAfterBreak="0">
+<w:numbering xmlns:w="http://schemas.openxmlformats.org/wordprocessingml/2006/main">
+  <w:abstractNum w:abstractNumId="990">
     <w:nsid w:val="0000A990"/>
     <w:multiLevelType w:val="multilevel"/>
-    <w:tmpl w:val="23E44434"/>
     <w:lvl w:ilvl="0">
       <w:numFmt w:val="bullet"/>
       <w:lvlText w:val=" "/>
@@ -784,10 +799,9 @@
       </w:pPr>
     </w:lvl>
   </w:abstractNum>
-  <w:abstractNum w:abstractNumId="1" w15:restartNumberingAfterBreak="0">
+  <w:abstractNum w:abstractNumId="991">
     <w:nsid w:val="0000A991"/>
     <w:multiLevelType w:val="multilevel"/>
-    <w:tmpl w:val="EE920EFA"/>
     <w:lvl w:ilvl="0">
       <w:numFmt w:val="bullet"/>
       <w:lvlText w:val=""/>
@@ -888,27 +902,27 @@
       </w:rPr>
     </w:lvl>
   </w:abstractNum>
-  <w:num w:numId="1" w16cid:durableId="1933078268">
-    <w:abstractNumId w:val="0"/>
+  <w:num w:numId="1000">
+    <w:abstractNumId w:val="990"/>
   </w:num>
-  <w:num w:numId="2" w16cid:durableId="416288384">
-    <w:abstractNumId w:val="1"/>
+  <w:num w:numId="1001">
+    <w:abstractNumId w:val="991"/>
   </w:num>
-  <w:num w:numId="3" w16cid:durableId="1292908150">
-    <w:abstractNumId w:val="1"/>
+  <w:num w:numId="1002">
+    <w:abstractNumId w:val="991"/>
   </w:num>
 </w:numbering>
 </file>
 
 <file path=word/styles.xml><?xml version="1.0" encoding="utf-8"?>
-<w:styles xmlns:mc="http://schemas.openxmlformats.org/markup-compatibility/2006" xmlns:r="http://schemas.openxmlformats.org/officeDocument/2006/relationships" xmlns:w="http://schemas.openxmlformats.org/wordprocessingml/2006/main" xmlns:w14="http://schemas.microsoft.com/office/word/2010/wordml" xmlns:w15="http://schemas.microsoft.com/office/word/2012/wordml" xmlns:w16cex="http://schemas.microsoft.com/office/word/2018/wordml/cex" xmlns:w16cid="http://schemas.microsoft.com/office/word/2016/wordml/cid" xmlns:w16="http://schemas.microsoft.com/office/word/2018/wordml" xmlns:w16du="http://schemas.microsoft.com/office/word/2023/wordml/word16du" xmlns:w16sdtdh="http://schemas.microsoft.com/office/word/2020/wordml/sdtdatahash" xmlns:w16sdtfl="http://schemas.microsoft.com/office/word/2024/wordml/sdtformatlock" xmlns:w16se="http://schemas.microsoft.com/office/word/2015/wordml/symex" mc:Ignorable="w14 w15 w16se w16cid w16 w16cex w16sdtdh w16sdtfl w16du">
+<w:styles xmlns:r="http://schemas.openxmlformats.org/officeDocument/2006/relationships" xmlns:w="http://schemas.openxmlformats.org/wordprocessingml/2006/main">
   <w:docDefaults>
     <w:rPrDefault>
       <w:rPr>
-        <w:rFonts w:asciiTheme="minorHAnsi" w:eastAsiaTheme="minorEastAsia" w:hAnsiTheme="minorHAnsi" w:cstheme="minorBidi"/>
+        <w:rFonts w:asciiTheme="minorHAnsi" w:cstheme="minorBidi" w:eastAsiaTheme="minorEastAsia" w:hAnsiTheme="minorHAnsi"/>
         <w:sz w:val="24"/>
         <w:szCs w:val="24"/>
-        <w:lang w:val="en-US" w:eastAsia="zh-CN" w:bidi="ar-SA"/>
+        <w:lang w:bidi="ar-SA" w:eastAsia="zh-CN" w:val="en-US"/>
       </w:rPr>
     </w:rPrDefault>
     <w:pPrDefault>
@@ -917,255 +931,168 @@
       </w:pPr>
     </w:pPrDefault>
   </w:docDefaults>
-  <w:latentStyles w:defLockedState="0" w:defUIPriority="0" w:defSemiHidden="0" w:defUnhideWhenUsed="0" w:defQFormat="0" w:count="376">
-    <w:lsdException w:name="Normal Table" w:semiHidden="1" w:unhideWhenUsed="1"/>
-    <w:lsdException w:name="Table Simple 1" w:semiHidden="1" w:unhideWhenUsed="1"/>
-    <w:lsdException w:name="Table Simple 2" w:semiHidden="1" w:unhideWhenUsed="1"/>
-    <w:lsdException w:name="Table Simple 3" w:semiHidden="1" w:unhideWhenUsed="1"/>
-    <w:lsdException w:name="Table Classic 1" w:semiHidden="1" w:unhideWhenUsed="1"/>
-    <w:lsdException w:name="Table Classic 2" w:semiHidden="1" w:unhideWhenUsed="1"/>
-    <w:lsdException w:name="Table Classic 3" w:semiHidden="1" w:unhideWhenUsed="1"/>
-    <w:lsdException w:name="Table Classic 4" w:semiHidden="1" w:unhideWhenUsed="1"/>
-    <w:lsdException w:name="Table Colorful 1" w:semiHidden="1" w:unhideWhenUsed="1"/>
-    <w:lsdException w:name="Table Colorful 2" w:semiHidden="1" w:unhideWhenUsed="1"/>
-    <w:lsdException w:name="Table Colorful 3" w:semiHidden="1" w:unhideWhenUsed="1"/>
-    <w:lsdException w:name="Table Columns 1" w:semiHidden="1" w:unhideWhenUsed="1"/>
-    <w:lsdException w:name="Table Columns 2" w:semiHidden="1" w:unhideWhenUsed="1"/>
-    <w:lsdException w:name="Table Columns 3" w:semiHidden="1" w:unhideWhenUsed="1"/>
-    <w:lsdException w:name="Table Columns 4" w:semiHidden="1" w:unhideWhenUsed="1"/>
-    <w:lsdException w:name="Table Columns 5" w:semiHidden="1" w:unhideWhenUsed="1"/>
-    <w:lsdException w:name="Table Grid 1" w:semiHidden="1" w:unhideWhenUsed="1"/>
-    <w:lsdException w:name="Table Grid 2" w:semiHidden="1" w:unhideWhenUsed="1"/>
-    <w:lsdException w:name="Table Grid 3" w:semiHidden="1" w:unhideWhenUsed="1"/>
-    <w:lsdException w:name="Table Grid 4" w:semiHidden="1" w:unhideWhenUsed="1"/>
-    <w:lsdException w:name="Table Grid 5" w:semiHidden="1" w:unhideWhenUsed="1"/>
-    <w:lsdException w:name="Table Grid 6" w:semiHidden="1" w:unhideWhenUsed="1"/>
-    <w:lsdException w:name="Table Grid 7" w:semiHidden="1" w:unhideWhenUsed="1"/>
-    <w:lsdException w:name="Table Grid 8" w:semiHidden="1" w:unhideWhenUsed="1"/>
-    <w:lsdException w:name="Table List 1" w:semiHidden="1" w:unhideWhenUsed="1"/>
-    <w:lsdException w:name="Table List 2" w:semiHidden="1" w:unhideWhenUsed="1"/>
-    <w:lsdException w:name="Table List 3" w:semiHidden="1" w:unhideWhenUsed="1"/>
-    <w:lsdException w:name="Table List 4" w:semiHidden="1" w:unhideWhenUsed="1"/>
-    <w:lsdException w:name="Table List 5" w:semiHidden="1" w:unhideWhenUsed="1"/>
-    <w:lsdException w:name="Table List 6" w:semiHidden="1" w:unhideWhenUsed="1"/>
-    <w:lsdException w:name="Table List 7" w:semiHidden="1" w:unhideWhenUsed="1"/>
-    <w:lsdException w:name="Table List 8" w:semiHidden="1" w:unhideWhenUsed="1"/>
-    <w:lsdException w:name="Table 3D effects 1" w:semiHidden="1" w:unhideWhenUsed="1"/>
-    <w:lsdException w:name="Table 3D effects 2" w:semiHidden="1" w:unhideWhenUsed="1"/>
-    <w:lsdException w:name="Table 3D effects 3" w:semiHidden="1" w:unhideWhenUsed="1"/>
-    <w:lsdException w:name="Table Contemporary" w:semiHidden="1" w:unhideWhenUsed="1"/>
-    <w:lsdException w:name="Table Elegant" w:semiHidden="1" w:unhideWhenUsed="1"/>
-    <w:lsdException w:name="Table Professional" w:semiHidden="1" w:unhideWhenUsed="1"/>
-    <w:lsdException w:name="Table Subtle 1" w:semiHidden="1" w:unhideWhenUsed="1"/>
-    <w:lsdException w:name="Table Subtle 2" w:semiHidden="1" w:unhideWhenUsed="1"/>
-    <w:lsdException w:name="Table Web 1" w:semiHidden="1" w:unhideWhenUsed="1"/>
-    <w:lsdException w:name="Table Web 2" w:semiHidden="1" w:unhideWhenUsed="1"/>
-    <w:lsdException w:name="Table Web 3" w:semiHidden="1" w:unhideWhenUsed="1"/>
-    <w:lsdException w:name="Table Theme" w:semiHidden="1" w:unhideWhenUsed="1"/>
-    <w:lsdException w:name="Light Shading"/>
-    <w:lsdException w:name="Light List"/>
-    <w:lsdException w:name="Light Grid"/>
-    <w:lsdException w:name="Medium Shading 1"/>
-    <w:lsdException w:name="Medium Shading 2"/>
-    <w:lsdException w:name="Medium List 1"/>
-    <w:lsdException w:name="Medium List 2"/>
-    <w:lsdException w:name="Medium Grid 1"/>
-    <w:lsdException w:name="Medium Grid 2"/>
-    <w:lsdException w:name="Medium Grid 3"/>
-    <w:lsdException w:name="Dark List"/>
-    <w:lsdException w:name="Colorful Shading"/>
-    <w:lsdException w:name="Colorful List"/>
-    <w:lsdException w:name="Colorful Grid"/>
-    <w:lsdException w:name="Light Shading Accent 1"/>
-    <w:lsdException w:name="Light List Accent 1"/>
-    <w:lsdException w:name="Light Grid Accent 1"/>
-    <w:lsdException w:name="Medium Shading 1 Accent 1"/>
-    <w:lsdException w:name="Medium Shading 2 Accent 1"/>
-    <w:lsdException w:name="Medium List 1 Accent 1"/>
-    <w:lsdException w:name="Medium List 2 Accent 1"/>
-    <w:lsdException w:name="Medium Grid 1 Accent 1"/>
-    <w:lsdException w:name="Medium Grid 2 Accent 1"/>
-    <w:lsdException w:name="Medium Grid 3 Accent 1"/>
-    <w:lsdException w:name="Dark List Accent 1"/>
-    <w:lsdException w:name="Colorful Shading Accent 1"/>
-    <w:lsdException w:name="Colorful List Accent 1"/>
-    <w:lsdException w:name="Colorful Grid Accent 1"/>
-    <w:lsdException w:name="Light Shading Accent 2"/>
-    <w:lsdException w:name="Light List Accent 2"/>
-    <w:lsdException w:name="Light Grid Accent 2"/>
-    <w:lsdException w:name="Medium Shading 1 Accent 2"/>
-    <w:lsdException w:name="Medium Shading 2 Accent 2"/>
-    <w:lsdException w:name="Medium List 1 Accent 2"/>
-    <w:lsdException w:name="Medium List 2 Accent 2"/>
-    <w:lsdException w:name="Medium Grid 1 Accent 2"/>
-    <w:lsdException w:name="Medium Grid 2 Accent 2"/>
-    <w:lsdException w:name="Medium Grid 3 Accent 2"/>
-    <w:lsdException w:name="Dark List Accent 2"/>
-    <w:lsdException w:name="Colorful Shading Accent 2"/>
-    <w:lsdException w:name="Colorful List Accent 2"/>
-    <w:lsdException w:name="Colorful Grid Accent 2"/>
-    <w:lsdException w:name="Light Shading Accent 3"/>
-    <w:lsdException w:name="Light List Accent 3"/>
-    <w:lsdException w:name="Light Grid Accent 3"/>
-    <w:lsdException w:name="Medium Shading 1 Accent 3"/>
-    <w:lsdException w:name="Medium Shading 2 Accent 3"/>
-    <w:lsdException w:name="Medium List 1 Accent 3"/>
-    <w:lsdException w:name="Medium List 2 Accent 3"/>
-    <w:lsdException w:name="Medium Grid 1 Accent 3"/>
-    <w:lsdException w:name="Medium Grid 2 Accent 3"/>
-    <w:lsdException w:name="Medium Grid 3 Accent 3"/>
-    <w:lsdException w:name="Dark List Accent 3"/>
-    <w:lsdException w:name="Colorful Shading Accent 3"/>
-    <w:lsdException w:name="Colorful List Accent 3"/>
-    <w:lsdException w:name="Colorful Grid Accent 3"/>
-    <w:lsdException w:name="Light Shading Accent 4"/>
-    <w:lsdException w:name="Light List Accent 4"/>
-    <w:lsdException w:name="Light Grid Accent 4"/>
-    <w:lsdException w:name="Medium Shading 1 Accent 4"/>
-    <w:lsdException w:name="Medium Shading 2 Accent 4"/>
-    <w:lsdException w:name="Medium List 1 Accent 4"/>
-    <w:lsdException w:name="Medium List 2 Accent 4"/>
-    <w:lsdException w:name="Medium Grid 1 Accent 4"/>
-    <w:lsdException w:name="Medium Grid 2 Accent 4"/>
-    <w:lsdException w:name="Medium Grid 3 Accent 4"/>
-    <w:lsdException w:name="Dark List Accent 4"/>
-    <w:lsdException w:name="Colorful Shading Accent 4"/>
-    <w:lsdException w:name="Colorful List Accent 4"/>
-    <w:lsdException w:name="Colorful Grid Accent 4"/>
-    <w:lsdException w:name="Light Shading Accent 5"/>
-    <w:lsdException w:name="Light List Accent 5"/>
-    <w:lsdException w:name="Light Grid Accent 5"/>
-    <w:lsdException w:name="Medium Shading 1 Accent 5"/>
-    <w:lsdException w:name="Medium Shading 2 Accent 5"/>
-    <w:lsdException w:name="Medium List 1 Accent 5"/>
-    <w:lsdException w:name="Medium List 2 Accent 5"/>
-    <w:lsdException w:name="Medium Grid 1 Accent 5"/>
-    <w:lsdException w:name="Medium Grid 2 Accent 5"/>
-    <w:lsdException w:name="Medium Grid 3 Accent 5"/>
-    <w:lsdException w:name="Dark List Accent 5"/>
-    <w:lsdException w:name="Colorful Shading Accent 5"/>
-    <w:lsdException w:name="Colorful List Accent 5"/>
-    <w:lsdException w:name="Colorful Grid Accent 5"/>
-    <w:lsdException w:name="Light Shading Accent 6"/>
-    <w:lsdException w:name="Light List Accent 6"/>
-    <w:lsdException w:name="Light Grid Accent 6"/>
-    <w:lsdException w:name="Medium Shading 1 Accent 6"/>
-    <w:lsdException w:name="Medium Shading 2 Accent 6"/>
-    <w:lsdException w:name="Medium List 1 Accent 6"/>
-    <w:lsdException w:name="Medium List 2 Accent 6"/>
-    <w:lsdException w:name="Medium Grid 1 Accent 6"/>
-    <w:lsdException w:name="Medium Grid 2 Accent 6"/>
-    <w:lsdException w:name="Medium Grid 3 Accent 6"/>
-    <w:lsdException w:name="Dark List Accent 6"/>
-    <w:lsdException w:name="Colorful Shading Accent 6"/>
-    <w:lsdException w:name="Colorful List Accent 6"/>
-    <w:lsdException w:name="Colorful Grid Accent 6"/>
-    <w:lsdException w:name="Grid Table 4" w:uiPriority="49"/>
-    <w:lsdException w:name="Grid Table 5 Dark" w:uiPriority="50"/>
-    <w:lsdException w:name="Grid Table 6 Colorful" w:uiPriority="51"/>
-    <w:lsdException w:name="Grid Table 7 Colorful" w:uiPriority="52"/>
-    <w:lsdException w:name="Grid Table 1 Light Accent 1" w:uiPriority="46"/>
-    <w:lsdException w:name="Grid Table 2 Accent 1" w:uiPriority="47"/>
-    <w:lsdException w:name="Grid Table 3 Accent 1" w:uiPriority="48"/>
-    <w:lsdException w:name="Grid Table 4 Accent 1" w:uiPriority="49"/>
-    <w:lsdException w:name="Grid Table 5 Dark Accent 1" w:uiPriority="50"/>
-    <w:lsdException w:name="Grid Table 6 Colorful Accent 1" w:uiPriority="51"/>
-    <w:lsdException w:name="Grid Table 7 Colorful Accent 1" w:uiPriority="52"/>
-    <w:lsdException w:name="Grid Table 1 Light Accent 2" w:uiPriority="46"/>
-    <w:lsdException w:name="Grid Table 2 Accent 2" w:uiPriority="47"/>
-    <w:lsdException w:name="Grid Table 3 Accent 2" w:uiPriority="48"/>
-    <w:lsdException w:name="Grid Table 4 Accent 2" w:uiPriority="49"/>
-    <w:lsdException w:name="Grid Table 5 Dark Accent 2" w:uiPriority="50"/>
-    <w:lsdException w:name="Grid Table 6 Colorful Accent 2" w:uiPriority="51"/>
-    <w:lsdException w:name="Grid Table 7 Colorful Accent 2" w:uiPriority="52"/>
-    <w:lsdException w:name="Grid Table 1 Light Accent 3" w:uiPriority="46"/>
-    <w:lsdException w:name="Grid Table 2 Accent 3" w:uiPriority="47"/>
-    <w:lsdException w:name="Grid Table 3 Accent 3" w:uiPriority="48"/>
-    <w:lsdException w:name="Grid Table 4 Accent 3" w:uiPriority="49"/>
-    <w:lsdException w:name="Grid Table 5 Dark Accent 3" w:uiPriority="50"/>
-    <w:lsdException w:name="Grid Table 6 Colorful Accent 3" w:uiPriority="51"/>
-    <w:lsdException w:name="Grid Table 7 Colorful Accent 3" w:uiPriority="52"/>
-    <w:lsdException w:name="Grid Table 1 Light Accent 4" w:uiPriority="46"/>
-    <w:lsdException w:name="Grid Table 2 Accent 4" w:uiPriority="47"/>
-    <w:lsdException w:name="Grid Table 3 Accent 4" w:uiPriority="48"/>
-    <w:lsdException w:name="Grid Table 4 Accent 4" w:uiPriority="49"/>
-    <w:lsdException w:name="Grid Table 5 Dark Accent 4" w:uiPriority="50"/>
-    <w:lsdException w:name="Grid Table 6 Colorful Accent 4" w:uiPriority="51"/>
-    <w:lsdException w:name="Grid Table 7 Colorful Accent 4" w:uiPriority="52"/>
-    <w:lsdException w:name="Grid Table 1 Light Accent 5" w:uiPriority="46"/>
-    <w:lsdException w:name="Grid Table 2 Accent 5" w:uiPriority="47"/>
-    <w:lsdException w:name="Grid Table 3 Accent 5" w:uiPriority="48"/>
-    <w:lsdException w:name="Grid Table 4 Accent 5" w:uiPriority="49"/>
-    <w:lsdException w:name="Grid Table 5 Dark Accent 5" w:uiPriority="50"/>
-    <w:lsdException w:name="Grid Table 6 Colorful Accent 5" w:uiPriority="51"/>
-    <w:lsdException w:name="Grid Table 7 Colorful Accent 5" w:uiPriority="52"/>
-    <w:lsdException w:name="Grid Table 1 Light Accent 6" w:uiPriority="46"/>
-    <w:lsdException w:name="Grid Table 2 Accent 6" w:uiPriority="47"/>
-    <w:lsdException w:name="Grid Table 3 Accent 6" w:uiPriority="48"/>
-    <w:lsdException w:name="Grid Table 4 Accent 6" w:uiPriority="49"/>
-    <w:lsdException w:name="Grid Table 5 Dark Accent 6" w:uiPriority="50"/>
-    <w:lsdException w:name="Grid Table 6 Colorful Accent 6" w:uiPriority="51"/>
-    <w:lsdException w:name="Grid Table 7 Colorful Accent 6" w:uiPriority="52"/>
-    <w:lsdException w:name="List Table 1 Light" w:uiPriority="46"/>
-    <w:lsdException w:name="List Table 2" w:uiPriority="47"/>
-    <w:lsdException w:name="List Table 3" w:uiPriority="48"/>
-    <w:lsdException w:name="List Table 4" w:uiPriority="49"/>
-    <w:lsdException w:name="List Table 5 Dark" w:uiPriority="50"/>
-    <w:lsdException w:name="List Table 6 Colorful" w:uiPriority="51"/>
-    <w:lsdException w:name="List Table 7 Colorful" w:uiPriority="52"/>
-    <w:lsdException w:name="List Table 1 Light Accent 1" w:uiPriority="46"/>
-    <w:lsdException w:name="List Table 2 Accent 1" w:uiPriority="47"/>
-    <w:lsdException w:name="List Table 3 Accent 1" w:uiPriority="48"/>
-    <w:lsdException w:name="List Table 4 Accent 1" w:uiPriority="49"/>
-    <w:lsdException w:name="List Table 5 Dark Accent 1" w:uiPriority="50"/>
-    <w:lsdException w:name="List Table 6 Colorful Accent 1" w:uiPriority="51"/>
-    <w:lsdException w:name="List Table 7 Colorful Accent 1" w:uiPriority="52"/>
-    <w:lsdException w:name="List Table 1 Light Accent 2" w:uiPriority="46"/>
-    <w:lsdException w:name="List Table 2 Accent 2" w:uiPriority="47"/>
-    <w:lsdException w:name="List Table 3 Accent 2" w:uiPriority="48"/>
-    <w:lsdException w:name="List Table 4 Accent 2" w:uiPriority="49"/>
-    <w:lsdException w:name="List Table 5 Dark Accent 2" w:uiPriority="50"/>
-    <w:lsdException w:name="List Table 6 Colorful Accent 2" w:uiPriority="51"/>
-    <w:lsdException w:name="List Table 7 Colorful Accent 2" w:uiPriority="52"/>
-    <w:lsdException w:name="List Table 1 Light Accent 3" w:uiPriority="46"/>
-    <w:lsdException w:name="List Table 2 Accent 3" w:uiPriority="47"/>
-    <w:lsdException w:name="List Table 3 Accent 3" w:uiPriority="48"/>
-    <w:lsdException w:name="List Table 4 Accent 3" w:uiPriority="49"/>
-    <w:lsdException w:name="List Table 5 Dark Accent 3" w:uiPriority="50"/>
-    <w:lsdException w:name="List Table 6 Colorful Accent 3" w:uiPriority="51"/>
-    <w:lsdException w:name="List Table 7 Colorful Accent 3" w:uiPriority="52"/>
-    <w:lsdException w:name="List Table 1 Light Accent 4" w:uiPriority="46"/>
-    <w:lsdException w:name="List Table 2 Accent 4" w:uiPriority="47"/>
-    <w:lsdException w:name="List Table 3 Accent 4" w:uiPriority="48"/>
-    <w:lsdException w:name="List Table 4 Accent 4" w:uiPriority="49"/>
-    <w:lsdException w:name="List Table 5 Dark Accent 4" w:uiPriority="50"/>
-    <w:lsdException w:name="List Table 6 Colorful Accent 4" w:uiPriority="51"/>
-    <w:lsdException w:name="List Table 7 Colorful Accent 4" w:uiPriority="52"/>
-    <w:lsdException w:name="List Table 1 Light Accent 5" w:uiPriority="46"/>
-    <w:lsdException w:name="List Table 2 Accent 5" w:uiPriority="47"/>
-    <w:lsdException w:name="List Table 3 Accent 5" w:uiPriority="48"/>
-    <w:lsdException w:name="List Table 4 Accent 5" w:uiPriority="49"/>
-    <w:lsdException w:name="List Table 5 Dark Accent 5" w:uiPriority="50"/>
-    <w:lsdException w:name="List Table 6 Colorful Accent 5" w:uiPriority="51"/>
-    <w:lsdException w:name="List Table 7 Colorful Accent 5" w:uiPriority="52"/>
-    <w:lsdException w:name="List Table 1 Light Accent 6" w:uiPriority="46"/>
-    <w:lsdException w:name="List Table 2 Accent 6" w:uiPriority="47"/>
-    <w:lsdException w:name="List Table 3 Accent 6" w:uiPriority="48"/>
-    <w:lsdException w:name="List Table 4 Accent 6" w:uiPriority="49"/>
-    <w:lsdException w:name="List Table 5 Dark Accent 6" w:uiPriority="50"/>
-    <w:lsdException w:name="List Table 6 Colorful Accent 6" w:uiPriority="51"/>
-    <w:lsdException w:name="List Table 7 Colorful Accent 6" w:uiPriority="52"/>
-    <w:lsdException w:name="Mention" w:semiHidden="1" w:uiPriority="99" w:unhideWhenUsed="1"/>
-    <w:lsdException w:name="Smart Hyperlink" w:semiHidden="1" w:uiPriority="99" w:unhideWhenUsed="1"/>
-    <w:lsdException w:name="Hashtag" w:semiHidden="1" w:uiPriority="99" w:unhideWhenUsed="1"/>
-    <w:lsdException w:name="Unresolved Mention" w:semiHidden="1" w:uiPriority="99" w:unhideWhenUsed="1"/>
-    <w:lsdException w:name="Smart Link" w:semiHidden="1" w:uiPriority="99" w:unhideWhenUsed="1"/>
-  </w:latentStyles>
-  <w:style w:type="paragraph" w:default="1" w:styleId="Normal">
+  <w:latentStyles w:count="276" w:defLockedState="0" w:defQFormat="0" w:defSemiHidden="0" w:defUIPriority="0" w:defUnhideWhenUsed="0"/>
+  <w:style w:default="1" w:styleId="Normal" w:type="paragraph">
     <w:name w:val="Normal"/>
     <w:qFormat/>
   </w:style>
-  <w:style w:type="paragraph" w:styleId="Heading1">
+  <w:style w:styleId="BodyText" w:type="paragraph">
+    <w:name w:val="Body Text"/>
+    <w:basedOn w:val="Normal"/>
+    <w:link w:val="BodyTextChar"/>
+    <w:qFormat/>
+    <w:pPr>
+      <w:spacing w:after="180" w:before="180"/>
+    </w:pPr>
+  </w:style>
+  <w:style w:customStyle="1" w:styleId="FirstParagraph" w:type="paragraph">
+    <w:name w:val="First Paragraph"/>
+    <w:basedOn w:val="BodyText"/>
+    <w:next w:val="BodyText"/>
+    <w:qFormat/>
+  </w:style>
+  <w:style w:customStyle="1" w:styleId="Compact" w:type="paragraph">
+    <w:name w:val="Compact"/>
+    <w:basedOn w:val="BodyText"/>
+    <w:qFormat/>
+    <w:pPr>
+      <w:spacing w:after="36" w:before="36"/>
+    </w:pPr>
+  </w:style>
+  <w:style w:styleId="Title" w:type="paragraph">
+    <w:name w:val="Title"/>
+    <w:basedOn w:val="Normal"/>
+    <w:next w:val="BodyText"/>
+    <w:link w:val="TitleChar"/>
+    <w:uiPriority w:val="10"/>
+    <w:qFormat/>
+    <w:rsid w:val="00A10FD9"/>
+    <w:pPr>
+      <w:spacing w:after="80" w:line="240" w:lineRule="auto"/>
+      <w:contextualSpacing/>
+      <w:jc w:val="center"/>
+    </w:pPr>
+    <w:rPr>
+      <w:rFonts w:asciiTheme="majorHAnsi" w:cstheme="majorBidi" w:eastAsiaTheme="majorEastAsia" w:hAnsiTheme="majorHAnsi"/>
+      <w:sz w:val="56"/>
+      <w:szCs w:val="56"/>
+    </w:rPr>
+  </w:style>
+  <w:style w:customStyle="1" w:styleId="TitleChar" w:type="character">
+    <w:name w:val="Title Char"/>
+    <w:basedOn w:val="DefaultParagraphFont"/>
+    <w:link w:val="Title"/>
+    <w:uiPriority w:val="10"/>
+    <w:rsid w:val="00A10FD9"/>
+    <w:rPr>
+      <w:rFonts w:asciiTheme="majorHAnsi" w:cstheme="majorBidi" w:eastAsiaTheme="majorEastAsia" w:hAnsiTheme="majorHAnsi"/>
+      <w:sz w:val="56"/>
+      <w:szCs w:val="56"/>
+    </w:rPr>
+  </w:style>
+  <w:style w:styleId="Subtitle" w:type="paragraph">
+    <w:name w:val="Subtitle"/>
+    <w:basedOn w:val="Title"/>
+    <w:next w:val="BodyText"/>
+    <w:link w:val="SubtitleChar"/>
+    <w:uiPriority w:val="11"/>
+    <w:qFormat/>
+    <w:rsid w:val="00A10FD9"/>
+    <w:pPr>
+      <w:numPr>
+        <w:ilvl w:val="1"/>
+      </w:numPr>
+    </w:pPr>
+    <w:rPr>
+      <w:rFonts w:cstheme="majorBidi" w:eastAsiaTheme="majorEastAsia"/>
+      <w:spacing w:val="15"/>
+      <w:sz w:val="28"/>
+      <w:szCs w:val="28"/>
+    </w:rPr>
+  </w:style>
+  <w:style w:customStyle="1" w:styleId="SubtitleChar" w:type="character">
+    <w:name w:val="Subtitle Char"/>
+    <w:basedOn w:val="DefaultParagraphFont"/>
+    <w:link w:val="Subtitle"/>
+    <w:uiPriority w:val="11"/>
+    <w:rsid w:val="00A10FD9"/>
+    <w:rPr>
+      <w:rFonts w:cstheme="majorBidi" w:eastAsiaTheme="majorEastAsia"/>
+      <w:color w:themeColor="text1" w:themeTint="A6" w:val="595959"/>
+      <w:spacing w:val="15"/>
+      <w:sz w:val="28"/>
+      <w:szCs w:val="28"/>
+    </w:rPr>
+  </w:style>
+  <w:style w:customStyle="1" w:styleId="Author" w:type="paragraph">
+    <w:name w:val="Author"/>
+    <w:basedOn w:val="Title"/>
+    <w:next w:val="BodyText"/>
+    <w:qFormat/>
+    <w:pPr>
+      <w:keepNext/>
+      <w:keepLines/>
+    </w:pPr>
+    <w:rPr>
+      <w:sz w:val="24"/>
+      <w:szCs w:val="24"/>
+    </w:rPr>
+  </w:style>
+  <w:style w:styleId="Date" w:type="paragraph">
+    <w:name w:val="Date"/>
+    <w:basedOn w:val="Title"/>
+    <w:next w:val="BodyText"/>
+    <w:qFormat/>
+    <w:pPr>
+      <w:keepNext/>
+      <w:keepLines/>
+    </w:pPr>
+    <w:rPr>
+      <w:sz w:val="24"/>
+      <w:szCs w:val="24"/>
+    </w:rPr>
+  </w:style>
+  <w:style w:customStyle="1" w:styleId="AbstractTitle" w:type="paragraph">
+    <w:name w:val="Abstract Title"/>
+    <w:basedOn w:val="Normal"/>
+    <w:next w:val="Abstract"/>
+    <w:qFormat/>
+    <w:pPr>
+      <w:keepNext/>
+      <w:keepLines/>
+      <w:spacing w:after="0" w:before="300"/>
+      <w:jc w:val="center"/>
+    </w:pPr>
+    <w:rPr>
+      <w:b/>
+      <w:sz w:val="20"/>
+      <w:szCs w:val="20"/>
+    </w:rPr>
+  </w:style>
+  <w:style w:customStyle="1" w:styleId="Abstract" w:type="paragraph">
+    <w:name w:val="Abstract"/>
+    <w:basedOn w:val="Normal"/>
+    <w:next w:val="BodyText"/>
+    <w:qFormat/>
+    <w:pPr>
+      <w:keepNext/>
+      <w:keepLines/>
+      <w:spacing w:after="300" w:before="100"/>
+    </w:pPr>
+    <w:rPr>
+      <w:sz w:val="20"/>
+      <w:szCs w:val="20"/>
+    </w:rPr>
+  </w:style>
+  <w:style w:styleId="Bibliography" w:type="paragraph">
+    <w:name w:val="Bibliography"/>
+    <w:basedOn w:val="Normal"/>
+    <w:next w:val="Bibliography"/>
+    <w:qFormat/>
+    <w:pPr/>
+    <w:rPr/>
+  </w:style>
+  <w:style w:styleId="Heading1" w:type="paragraph">
     <w:name w:val="heading 1"/>
     <w:basedOn w:val="Normal"/>
     <w:next w:val="BodyText"/>
@@ -1176,17 +1103,17 @@
     <w:pPr>
       <w:keepNext/>
       <w:keepLines/>
-      <w:spacing w:before="360" w:after="80"/>
+      <w:spacing w:after="80" w:before="360"/>
       <w:outlineLvl w:val="0"/>
     </w:pPr>
     <w:rPr>
-      <w:rFonts w:asciiTheme="majorHAnsi" w:eastAsiaTheme="majorEastAsia" w:hAnsiTheme="majorHAnsi" w:cstheme="majorBidi"/>
-      <w:color w:val="0F4761" w:themeColor="accent1" w:themeShade="BF"/>
+      <w:rFonts w:asciiTheme="majorHAnsi" w:cstheme="majorBidi" w:eastAsiaTheme="majorEastAsia" w:hAnsiTheme="majorHAnsi"/>
+      <w:color w:themeColor="accent1" w:themeShade="BF" w:val="0F4761"/>
       <w:sz w:val="40"/>
       <w:szCs w:val="40"/>
     </w:rPr>
   </w:style>
-  <w:style w:type="paragraph" w:styleId="Heading2">
+  <w:style w:styleId="Heading2" w:type="paragraph">
     <w:name w:val="heading 2"/>
     <w:basedOn w:val="Normal"/>
     <w:next w:val="BodyText"/>
@@ -1199,17 +1126,17 @@
     <w:pPr>
       <w:keepNext/>
       <w:keepLines/>
-      <w:spacing w:before="160" w:after="80"/>
+      <w:spacing w:after="80" w:before="160"/>
       <w:outlineLvl w:val="1"/>
     </w:pPr>
     <w:rPr>
-      <w:rFonts w:asciiTheme="majorHAnsi" w:eastAsiaTheme="majorEastAsia" w:hAnsiTheme="majorHAnsi" w:cstheme="majorBidi"/>
-      <w:color w:val="0F4761" w:themeColor="accent1" w:themeShade="BF"/>
+      <w:rFonts w:asciiTheme="majorHAnsi" w:cstheme="majorBidi" w:eastAsiaTheme="majorEastAsia" w:hAnsiTheme="majorHAnsi"/>
+      <w:color w:themeColor="accent1" w:themeShade="BF" w:val="0F4761"/>
       <w:sz w:val="32"/>
       <w:szCs w:val="32"/>
     </w:rPr>
   </w:style>
-  <w:style w:type="paragraph" w:styleId="Heading3">
+  <w:style w:styleId="Heading3" w:type="paragraph">
     <w:name w:val="heading 3"/>
     <w:basedOn w:val="Normal"/>
     <w:next w:val="BodyText"/>
@@ -1222,17 +1149,17 @@
     <w:pPr>
       <w:keepNext/>
       <w:keepLines/>
-      <w:spacing w:before="160" w:after="80"/>
+      <w:spacing w:after="80" w:before="160"/>
       <w:outlineLvl w:val="2"/>
     </w:pPr>
     <w:rPr>
-      <w:rFonts w:eastAsiaTheme="majorEastAsia" w:cstheme="majorBidi"/>
-      <w:color w:val="0F4761" w:themeColor="accent1" w:themeShade="BF"/>
+      <w:rFonts w:cstheme="majorBidi" w:eastAsiaTheme="majorEastAsia"/>
+      <w:color w:themeColor="accent1" w:themeShade="BF" w:val="0F4761"/>
       <w:sz w:val="28"/>
       <w:szCs w:val="28"/>
     </w:rPr>
   </w:style>
-  <w:style w:type="paragraph" w:styleId="Heading4">
+  <w:style w:styleId="Heading4" w:type="paragraph">
     <w:name w:val="heading 4"/>
     <w:basedOn w:val="Normal"/>
     <w:next w:val="BodyText"/>
@@ -1245,17 +1172,17 @@
     <w:pPr>
       <w:keepNext/>
       <w:keepLines/>
-      <w:spacing w:before="80" w:after="40"/>
+      <w:spacing w:after="40" w:before="80"/>
       <w:outlineLvl w:val="3"/>
     </w:pPr>
     <w:rPr>
-      <w:rFonts w:eastAsiaTheme="majorEastAsia" w:cstheme="majorBidi"/>
+      <w:rFonts w:cstheme="majorBidi" w:eastAsiaTheme="majorEastAsia"/>
       <w:i/>
       <w:iCs/>
-      <w:color w:val="0F4761" w:themeColor="accent1" w:themeShade="BF"/>
-    </w:rPr>
-  </w:style>
-  <w:style w:type="paragraph" w:styleId="Heading5">
+      <w:color w:themeColor="accent1" w:themeShade="BF" w:val="0F4761"/>
+    </w:rPr>
+  </w:style>
+  <w:style w:styleId="Heading5" w:type="paragraph">
     <w:name w:val="heading 5"/>
     <w:basedOn w:val="Normal"/>
     <w:next w:val="BodyText"/>
@@ -1268,15 +1195,15 @@
     <w:pPr>
       <w:keepNext/>
       <w:keepLines/>
-      <w:spacing w:before="80" w:after="40"/>
+      <w:spacing w:after="40" w:before="80"/>
       <w:outlineLvl w:val="4"/>
     </w:pPr>
     <w:rPr>
-      <w:rFonts w:eastAsiaTheme="majorEastAsia" w:cstheme="majorBidi"/>
-      <w:color w:val="0F4761" w:themeColor="accent1" w:themeShade="BF"/>
-    </w:rPr>
-  </w:style>
-  <w:style w:type="paragraph" w:styleId="Heading6">
+      <w:rFonts w:cstheme="majorBidi" w:eastAsiaTheme="majorEastAsia"/>
+      <w:color w:themeColor="accent1" w:themeShade="BF" w:val="0F4761"/>
+    </w:rPr>
+  </w:style>
+  <w:style w:styleId="Heading6" w:type="paragraph">
     <w:name w:val="heading 6"/>
     <w:basedOn w:val="Normal"/>
     <w:next w:val="BodyText"/>
@@ -1289,17 +1216,17 @@
     <w:pPr>
       <w:keepNext/>
       <w:keepLines/>
-      <w:spacing w:before="40" w:after="0"/>
+      <w:spacing w:after="0" w:before="40"/>
       <w:outlineLvl w:val="5"/>
     </w:pPr>
     <w:rPr>
-      <w:rFonts w:eastAsiaTheme="majorEastAsia" w:cstheme="majorBidi"/>
+      <w:rFonts w:cstheme="majorBidi" w:eastAsiaTheme="majorEastAsia"/>
       <w:i/>
       <w:iCs/>
-      <w:color w:val="595959" w:themeColor="text1" w:themeTint="A6"/>
-    </w:rPr>
-  </w:style>
-  <w:style w:type="paragraph" w:styleId="Heading7">
+      <w:color w:themeColor="text1" w:themeTint="A6" w:val="595959"/>
+    </w:rPr>
+  </w:style>
+  <w:style w:styleId="Heading7" w:type="paragraph">
     <w:name w:val="heading 7"/>
     <w:basedOn w:val="Normal"/>
     <w:next w:val="BodyText"/>
@@ -1312,15 +1239,15 @@
     <w:pPr>
       <w:keepNext/>
       <w:keepLines/>
-      <w:spacing w:before="40" w:after="0"/>
+      <w:spacing w:after="0" w:before="40"/>
       <w:outlineLvl w:val="6"/>
     </w:pPr>
     <w:rPr>
-      <w:rFonts w:eastAsiaTheme="majorEastAsia" w:cstheme="majorBidi"/>
-      <w:color w:val="595959" w:themeColor="text1" w:themeTint="A6"/>
-    </w:rPr>
-  </w:style>
-  <w:style w:type="paragraph" w:styleId="Heading8">
+      <w:rFonts w:cstheme="majorBidi" w:eastAsiaTheme="majorEastAsia"/>
+      <w:color w:themeColor="text1" w:themeTint="A6" w:val="595959"/>
+    </w:rPr>
+  </w:style>
+  <w:style w:styleId="Heading8" w:type="paragraph">
     <w:name w:val="heading 8"/>
     <w:basedOn w:val="Normal"/>
     <w:next w:val="BodyText"/>
@@ -1337,13 +1264,13 @@
       <w:outlineLvl w:val="7"/>
     </w:pPr>
     <w:rPr>
-      <w:rFonts w:eastAsiaTheme="majorEastAsia" w:cstheme="majorBidi"/>
+      <w:rFonts w:cstheme="majorBidi" w:eastAsiaTheme="majorEastAsia"/>
       <w:i/>
       <w:iCs/>
-      <w:color w:val="272727" w:themeColor="text1" w:themeTint="D8"/>
-    </w:rPr>
-  </w:style>
-  <w:style w:type="paragraph" w:styleId="Heading9">
+      <w:color w:themeColor="text1" w:themeTint="D8" w:val="272727"/>
+    </w:rPr>
+  </w:style>
+  <w:style w:styleId="Heading9" w:type="paragraph">
     <w:name w:val="heading 9"/>
     <w:basedOn w:val="Normal"/>
     <w:next w:val="BodyText"/>
@@ -1360,202 +1287,24 @@
       <w:outlineLvl w:val="8"/>
     </w:pPr>
     <w:rPr>
-      <w:rFonts w:eastAsiaTheme="majorEastAsia" w:cstheme="majorBidi"/>
-      <w:color w:val="272727" w:themeColor="text1" w:themeTint="D8"/>
-    </w:rPr>
-  </w:style>
-  <w:style w:type="character" w:default="1" w:styleId="DefaultParagraphFont">
-    <w:name w:val="Default Paragraph Font"/>
-    <w:uiPriority w:val="1"/>
-    <w:semiHidden/>
-    <w:unhideWhenUsed/>
-  </w:style>
-  <w:style w:type="table" w:default="1" w:styleId="TableNormal">
-    <w:name w:val="Normal Table"/>
-    <w:uiPriority w:val="99"/>
-    <w:semiHidden/>
-    <w:unhideWhenUsed/>
-    <w:tblPr>
-      <w:tblInd w:w="0" w:type="dxa"/>
-      <w:tblCellMar>
-        <w:top w:w="0" w:type="dxa"/>
-        <w:left w:w="108" w:type="dxa"/>
-        <w:bottom w:w="0" w:type="dxa"/>
-        <w:right w:w="108" w:type="dxa"/>
-      </w:tblCellMar>
-    </w:tblPr>
-  </w:style>
-  <w:style w:type="numbering" w:default="1" w:styleId="NoList">
-    <w:name w:val="No List"/>
-    <w:uiPriority w:val="99"/>
-    <w:semiHidden/>
-    <w:unhideWhenUsed/>
-  </w:style>
-  <w:style w:type="paragraph" w:styleId="BodyText">
-    <w:name w:val="Body Text"/>
-    <w:basedOn w:val="Normal"/>
-    <w:qFormat/>
-    <w:pPr>
-      <w:spacing w:before="180" w:after="180"/>
-    </w:pPr>
-  </w:style>
-  <w:style w:type="paragraph" w:customStyle="1" w:styleId="FirstParagraph">
-    <w:name w:val="First Paragraph"/>
-    <w:basedOn w:val="BodyText"/>
-    <w:next w:val="BodyText"/>
-    <w:qFormat/>
-  </w:style>
-  <w:style w:type="paragraph" w:customStyle="1" w:styleId="Compact">
-    <w:name w:val="Compact"/>
-    <w:basedOn w:val="BodyText"/>
-    <w:qFormat/>
-    <w:pPr>
-      <w:spacing w:before="36" w:after="36"/>
-    </w:pPr>
-  </w:style>
-  <w:style w:type="paragraph" w:styleId="Title">
-    <w:name w:val="Title"/>
-    <w:basedOn w:val="Normal"/>
-    <w:next w:val="BodyText"/>
-    <w:link w:val="TitleChar"/>
-    <w:uiPriority w:val="10"/>
-    <w:qFormat/>
-    <w:rsid w:val="00A10FD9"/>
-    <w:pPr>
-      <w:spacing w:after="80"/>
-      <w:contextualSpacing/>
-      <w:jc w:val="center"/>
-    </w:pPr>
-    <w:rPr>
-      <w:rFonts w:asciiTheme="majorHAnsi" w:eastAsiaTheme="majorEastAsia" w:hAnsiTheme="majorHAnsi" w:cstheme="majorBidi"/>
-      <w:sz w:val="56"/>
-      <w:szCs w:val="56"/>
-    </w:rPr>
-  </w:style>
-  <w:style w:type="character" w:customStyle="1" w:styleId="TitleChar">
-    <w:name w:val="Title Char"/>
-    <w:basedOn w:val="DefaultParagraphFont"/>
-    <w:link w:val="Title"/>
-    <w:uiPriority w:val="10"/>
-    <w:rsid w:val="00A10FD9"/>
-    <w:rPr>
-      <w:rFonts w:asciiTheme="majorHAnsi" w:eastAsiaTheme="majorEastAsia" w:hAnsiTheme="majorHAnsi" w:cstheme="majorBidi"/>
-      <w:sz w:val="56"/>
-      <w:szCs w:val="56"/>
-    </w:rPr>
-  </w:style>
-  <w:style w:type="paragraph" w:styleId="Subtitle">
-    <w:name w:val="Subtitle"/>
-    <w:basedOn w:val="Title"/>
-    <w:next w:val="BodyText"/>
-    <w:link w:val="SubtitleChar"/>
-    <w:uiPriority w:val="11"/>
-    <w:qFormat/>
-    <w:rsid w:val="00A10FD9"/>
-    <w:pPr>
-      <w:numPr>
-        <w:ilvl w:val="1"/>
-      </w:numPr>
-    </w:pPr>
-    <w:rPr>
-      <w:spacing w:val="15"/>
-      <w:sz w:val="28"/>
-      <w:szCs w:val="28"/>
-    </w:rPr>
-  </w:style>
-  <w:style w:type="character" w:customStyle="1" w:styleId="SubtitleChar">
-    <w:name w:val="Subtitle Char"/>
-    <w:basedOn w:val="DefaultParagraphFont"/>
-    <w:link w:val="Subtitle"/>
-    <w:uiPriority w:val="11"/>
-    <w:rsid w:val="00A10FD9"/>
-    <w:rPr>
-      <w:rFonts w:eastAsiaTheme="majorEastAsia" w:cstheme="majorBidi"/>
-      <w:color w:val="595959" w:themeColor="text1" w:themeTint="A6"/>
-      <w:spacing w:val="15"/>
-      <w:sz w:val="28"/>
-      <w:szCs w:val="28"/>
-    </w:rPr>
-  </w:style>
-  <w:style w:type="paragraph" w:customStyle="1" w:styleId="Author">
-    <w:name w:val="Author"/>
-    <w:basedOn w:val="Title"/>
-    <w:next w:val="BodyText"/>
-    <w:qFormat/>
-    <w:pPr>
-      <w:keepNext/>
-      <w:keepLines/>
-    </w:pPr>
-    <w:rPr>
-      <w:sz w:val="24"/>
-      <w:szCs w:val="24"/>
-    </w:rPr>
-  </w:style>
-  <w:style w:type="paragraph" w:styleId="Date">
-    <w:name w:val="Date"/>
-    <w:basedOn w:val="Title"/>
-    <w:next w:val="BodyText"/>
-    <w:qFormat/>
-    <w:pPr>
-      <w:keepNext/>
-      <w:keepLines/>
-    </w:pPr>
-    <w:rPr>
-      <w:sz w:val="24"/>
-      <w:szCs w:val="24"/>
-    </w:rPr>
-  </w:style>
-  <w:style w:type="paragraph" w:customStyle="1" w:styleId="AbstractTitle">
-    <w:name w:val="Abstract Title"/>
-    <w:basedOn w:val="Normal"/>
-    <w:next w:val="Abstract"/>
-    <w:qFormat/>
-    <w:pPr>
-      <w:keepNext/>
-      <w:keepLines/>
-      <w:spacing w:before="300" w:after="0"/>
-      <w:jc w:val="center"/>
-    </w:pPr>
-    <w:rPr>
-      <w:b/>
-      <w:sz w:val="20"/>
-      <w:szCs w:val="20"/>
-    </w:rPr>
-  </w:style>
-  <w:style w:type="paragraph" w:customStyle="1" w:styleId="Abstract">
-    <w:name w:val="Abstract"/>
-    <w:basedOn w:val="Normal"/>
-    <w:next w:val="BodyText"/>
-    <w:qFormat/>
-    <w:pPr>
-      <w:keepNext/>
-      <w:keepLines/>
-      <w:spacing w:before="100" w:after="300"/>
-    </w:pPr>
-    <w:rPr>
-      <w:sz w:val="20"/>
-      <w:szCs w:val="20"/>
-    </w:rPr>
-  </w:style>
-  <w:style w:type="paragraph" w:styleId="Bibliography">
-    <w:name w:val="Bibliography"/>
-    <w:basedOn w:val="Normal"/>
-    <w:qFormat/>
-  </w:style>
-  <w:style w:type="character" w:customStyle="1" w:styleId="Heading1Char">
+      <w:rFonts w:cstheme="majorBidi" w:eastAsiaTheme="majorEastAsia"/>
+      <w:color w:themeColor="text1" w:themeTint="D8" w:val="272727"/>
+    </w:rPr>
+  </w:style>
+  <w:style w:customStyle="1" w:styleId="Heading1Char" w:type="character">
     <w:name w:val="Heading 1 Char"/>
     <w:basedOn w:val="DefaultParagraphFont"/>
     <w:link w:val="Heading1"/>
     <w:uiPriority w:val="9"/>
     <w:rsid w:val="00A10FD9"/>
     <w:rPr>
-      <w:rFonts w:asciiTheme="majorHAnsi" w:eastAsiaTheme="majorEastAsia" w:hAnsiTheme="majorHAnsi" w:cstheme="majorBidi"/>
-      <w:color w:val="0F4761" w:themeColor="accent1" w:themeShade="BF"/>
+      <w:rFonts w:asciiTheme="majorHAnsi" w:cstheme="majorBidi" w:eastAsiaTheme="majorEastAsia" w:hAnsiTheme="majorHAnsi"/>
+      <w:color w:themeColor="accent1" w:themeShade="BF" w:val="0F4761"/>
       <w:sz w:val="40"/>
       <w:szCs w:val="40"/>
     </w:rPr>
   </w:style>
-  <w:style w:type="character" w:customStyle="1" w:styleId="Heading2Char">
+  <w:style w:customStyle="1" w:styleId="Heading2Char" w:type="character">
     <w:name w:val="Heading 2 Char"/>
     <w:basedOn w:val="DefaultParagraphFont"/>
     <w:link w:val="Heading2"/>
@@ -1563,13 +1312,13 @@
     <w:semiHidden/>
     <w:rsid w:val="00A10FD9"/>
     <w:rPr>
-      <w:rFonts w:asciiTheme="majorHAnsi" w:eastAsiaTheme="majorEastAsia" w:hAnsiTheme="majorHAnsi" w:cstheme="majorBidi"/>
-      <w:color w:val="0F4761" w:themeColor="accent1" w:themeShade="BF"/>
+      <w:rFonts w:asciiTheme="majorHAnsi" w:cstheme="majorBidi" w:eastAsiaTheme="majorEastAsia" w:hAnsiTheme="majorHAnsi"/>
+      <w:color w:themeColor="accent1" w:themeShade="BF" w:val="0F4761"/>
       <w:sz w:val="32"/>
       <w:szCs w:val="32"/>
     </w:rPr>
   </w:style>
-  <w:style w:type="character" w:customStyle="1" w:styleId="Heading3Char">
+  <w:style w:customStyle="1" w:styleId="Heading3Char" w:type="character">
     <w:name w:val="Heading 3 Char"/>
     <w:basedOn w:val="DefaultParagraphFont"/>
     <w:link w:val="Heading3"/>
@@ -1577,13 +1326,13 @@
     <w:semiHidden/>
     <w:rsid w:val="00A10FD9"/>
     <w:rPr>
-      <w:rFonts w:eastAsiaTheme="majorEastAsia" w:cstheme="majorBidi"/>
-      <w:color w:val="0F4761" w:themeColor="accent1" w:themeShade="BF"/>
+      <w:rFonts w:cstheme="majorBidi" w:eastAsiaTheme="majorEastAsia"/>
+      <w:color w:themeColor="accent1" w:themeShade="BF" w:val="0F4761"/>
       <w:sz w:val="28"/>
       <w:szCs w:val="28"/>
     </w:rPr>
   </w:style>
-  <w:style w:type="character" w:customStyle="1" w:styleId="Heading4Char">
+  <w:style w:customStyle="1" w:styleId="Heading4Char" w:type="character">
     <w:name w:val="Heading 4 Char"/>
     <w:basedOn w:val="DefaultParagraphFont"/>
     <w:link w:val="Heading4"/>
@@ -1591,13 +1340,13 @@
     <w:semiHidden/>
     <w:rsid w:val="00A10FD9"/>
     <w:rPr>
-      <w:rFonts w:eastAsiaTheme="majorEastAsia" w:cstheme="majorBidi"/>
+      <w:rFonts w:cstheme="majorBidi" w:eastAsiaTheme="majorEastAsia"/>
       <w:i/>
       <w:iCs/>
-      <w:color w:val="0F4761" w:themeColor="accent1" w:themeShade="BF"/>
-    </w:rPr>
-  </w:style>
-  <w:style w:type="character" w:customStyle="1" w:styleId="Heading5Char">
+      <w:color w:themeColor="accent1" w:themeShade="BF" w:val="0F4761"/>
+    </w:rPr>
+  </w:style>
+  <w:style w:customStyle="1" w:styleId="Heading5Char" w:type="character">
     <w:name w:val="Heading 5 Char"/>
     <w:basedOn w:val="DefaultParagraphFont"/>
     <w:link w:val="Heading5"/>
@@ -1605,11 +1354,11 @@
     <w:semiHidden/>
     <w:rsid w:val="00A10FD9"/>
     <w:rPr>
-      <w:rFonts w:eastAsiaTheme="majorEastAsia" w:cstheme="majorBidi"/>
-      <w:color w:val="0F4761" w:themeColor="accent1" w:themeShade="BF"/>
-    </w:rPr>
-  </w:style>
-  <w:style w:type="character" w:customStyle="1" w:styleId="Heading6Char">
+      <w:rFonts w:cstheme="majorBidi" w:eastAsiaTheme="majorEastAsia"/>
+      <w:color w:themeColor="accent1" w:themeShade="BF" w:val="0F4761"/>
+    </w:rPr>
+  </w:style>
+  <w:style w:customStyle="1" w:styleId="Heading6Char" w:type="character">
     <w:name w:val="Heading 6 Char"/>
     <w:basedOn w:val="DefaultParagraphFont"/>
     <w:link w:val="Heading6"/>
@@ -1617,13 +1366,13 @@
     <w:semiHidden/>
     <w:rsid w:val="00A10FD9"/>
     <w:rPr>
-      <w:rFonts w:eastAsiaTheme="majorEastAsia" w:cstheme="majorBidi"/>
+      <w:rFonts w:cstheme="majorBidi" w:eastAsiaTheme="majorEastAsia"/>
       <w:i/>
       <w:iCs/>
-      <w:color w:val="595959" w:themeColor="text1" w:themeTint="A6"/>
-    </w:rPr>
-  </w:style>
-  <w:style w:type="character" w:customStyle="1" w:styleId="Heading7Char">
+      <w:color w:themeColor="text1" w:themeTint="A6" w:val="595959"/>
+    </w:rPr>
+  </w:style>
+  <w:style w:customStyle="1" w:styleId="Heading7Char" w:type="character">
     <w:name w:val="Heading 7 Char"/>
     <w:basedOn w:val="DefaultParagraphFont"/>
     <w:link w:val="Heading7"/>
@@ -1631,11 +1380,11 @@
     <w:semiHidden/>
     <w:rsid w:val="00A10FD9"/>
     <w:rPr>
-      <w:rFonts w:eastAsiaTheme="majorEastAsia" w:cstheme="majorBidi"/>
-      <w:color w:val="595959" w:themeColor="text1" w:themeTint="A6"/>
-    </w:rPr>
-  </w:style>
-  <w:style w:type="character" w:customStyle="1" w:styleId="Heading8Char">
+      <w:rFonts w:cstheme="majorBidi" w:eastAsiaTheme="majorEastAsia"/>
+      <w:color w:themeColor="text1" w:themeTint="A6" w:val="595959"/>
+    </w:rPr>
+  </w:style>
+  <w:style w:customStyle="1" w:styleId="Heading8Char" w:type="character">
     <w:name w:val="Heading 8 Char"/>
     <w:basedOn w:val="DefaultParagraphFont"/>
     <w:link w:val="Heading8"/>
@@ -1643,13 +1392,13 @@
     <w:semiHidden/>
     <w:rsid w:val="00A10FD9"/>
     <w:rPr>
-      <w:rFonts w:eastAsiaTheme="majorEastAsia" w:cstheme="majorBidi"/>
+      <w:rFonts w:cstheme="majorBidi" w:eastAsiaTheme="majorEastAsia"/>
       <w:i/>
       <w:iCs/>
-      <w:color w:val="272727" w:themeColor="text1" w:themeTint="D8"/>
-    </w:rPr>
-  </w:style>
-  <w:style w:type="character" w:customStyle="1" w:styleId="Heading9Char">
+      <w:color w:themeColor="text1" w:themeTint="D8" w:val="272727"/>
+    </w:rPr>
+  </w:style>
+  <w:style w:customStyle="1" w:styleId="Heading9Char" w:type="character">
     <w:name w:val="Heading 9 Char"/>
     <w:basedOn w:val="DefaultParagraphFont"/>
     <w:link w:val="Heading9"/>
@@ -1657,11 +1406,11 @@
     <w:semiHidden/>
     <w:rsid w:val="00A10FD9"/>
     <w:rPr>
-      <w:rFonts w:eastAsiaTheme="majorEastAsia" w:cstheme="majorBidi"/>
-      <w:color w:val="272727" w:themeColor="text1" w:themeTint="D8"/>
-    </w:rPr>
-  </w:style>
-  <w:style w:type="paragraph" w:styleId="BlockText">
+      <w:rFonts w:cstheme="majorBidi" w:eastAsiaTheme="majorEastAsia"/>
+      <w:color w:themeColor="text1" w:themeTint="D8" w:val="272727"/>
+    </w:rPr>
+  </w:style>
+  <w:style w:styleId="BlockText" w:type="paragraph">
     <w:name w:val="Block Text"/>
     <w:basedOn w:val="BodyText"/>
     <w:next w:val="BodyText"/>
@@ -1669,18 +1418,19 @@
     <w:unhideWhenUsed/>
     <w:qFormat/>
     <w:pPr>
-      <w:spacing w:before="100" w:after="100"/>
-      <w:ind w:left="480" w:right="480"/>
-    </w:pPr>
-  </w:style>
-  <w:style w:type="paragraph" w:styleId="FootnoteText">
-    <w:name w:val="footnote text"/>
+      <w:spacing w:after="100" w:before="100"/>
+      <w:ind w:firstLine="0" w:left="480" w:right="480"/>
+    </w:pPr>
+  </w:style>
+  <w:style w:styleId="FootnoteText" w:type="paragraph">
+    <w:name w:val="Footnote Text"/>
     <w:basedOn w:val="Normal"/>
+    <w:next w:val="FootnoteText"/>
     <w:uiPriority w:val="9"/>
     <w:unhideWhenUsed/>
     <w:qFormat/>
   </w:style>
-  <w:style w:type="paragraph" w:customStyle="1" w:styleId="FootnoteBlockText">
+  <w:style w:styleId="FootnoteBlockText" w:type="paragraph">
     <w:name w:val="Footnote Block Text"/>
     <w:basedOn w:val="FootnoteText"/>
     <w:next w:val="FootnoteText"/>
@@ -1688,35 +1438,40 @@
     <w:unhideWhenUsed/>
     <w:qFormat/>
     <w:pPr>
-      <w:spacing w:before="100" w:after="100"/>
-      <w:ind w:left="480" w:right="480"/>
-    </w:pPr>
-  </w:style>
-  <w:style w:type="table" w:customStyle="1" w:styleId="Table">
-    <w:name w:val="Table"/>
+      <w:spacing w:after="100" w:before="100"/>
+      <w:ind w:firstLine="0" w:left="480" w:right="480"/>
+    </w:pPr>
+  </w:style>
+  <w:style w:default="1" w:styleId="DefaultParagraphFont" w:type="character">
+    <w:name w:val="Default Paragraph Font"/>
     <w:semiHidden/>
     <w:unhideWhenUsed/>
+  </w:style>
+  <w:style w:default="1" w:styleId="Table" w:type="table">
+    <w:name w:val="Table"/>
+    <w:basedOn w:val="TableNormal"/>
+    <w:semiHidden/>
+    <w:unhideWhenUsed/>
     <w:qFormat/>
     <w:tblPr>
-      <w:tblInd w:w="0" w:type="dxa"/>
+      <w:tblInd w:type="dxa" w:w="0"/>
       <w:tblCellMar>
-        <w:top w:w="0" w:type="dxa"/>
-        <w:left w:w="108" w:type="dxa"/>
-        <w:bottom w:w="0" w:type="dxa"/>
-        <w:right w:w="108" w:type="dxa"/>
+        <w:top w:type="dxa" w:w="0"/>
+        <w:left w:type="dxa" w:w="108"/>
+        <w:bottom w:type="dxa" w:w="0"/>
+        <w:right w:type="dxa" w:w="108"/>
       </w:tblCellMar>
     </w:tblPr>
     <w:tblStylePr w:type="firstRow">
-      <w:tblPr/>
       <w:tcPr>
         <w:tcBorders>
-          <w:bottom w:val="single" w:sz="0" w:space="0" w:color="auto"/>
+          <w:bottom w:val="single"/>
         </w:tcBorders>
         <w:vAlign w:val="bottom"/>
       </w:tcPr>
     </w:tblStylePr>
   </w:style>
-  <w:style w:type="paragraph" w:customStyle="1" w:styleId="DefinitionTerm">
+  <w:style w:customStyle="1" w:styleId="DefinitionTerm" w:type="paragraph">
     <w:name w:val="Definition Term"/>
     <w:basedOn w:val="Normal"/>
     <w:next w:val="Definition"/>
@@ -1729,76 +1484,75 @@
       <w:b/>
     </w:rPr>
   </w:style>
-  <w:style w:type="paragraph" w:customStyle="1" w:styleId="Definition">
+  <w:style w:customStyle="1" w:styleId="Definition" w:type="paragraph">
     <w:name w:val="Definition"/>
     <w:basedOn w:val="Normal"/>
   </w:style>
-  <w:style w:type="paragraph" w:styleId="Caption">
-    <w:name w:val="caption"/>
+  <w:style w:styleId="Caption" w:type="paragraph">
+    <w:name w:val="Caption"/>
     <w:basedOn w:val="Normal"/>
-    <w:link w:val="CaptionChar"/>
-    <w:pPr>
-      <w:spacing w:after="120"/>
+    <w:link w:val="BodyTextChar"/>
+    <w:pPr>
+      <w:spacing w:after="120" w:before="0"/>
     </w:pPr>
     <w:rPr>
       <w:i/>
     </w:rPr>
   </w:style>
-  <w:style w:type="paragraph" w:customStyle="1" w:styleId="TableCaption">
+  <w:style w:customStyle="1" w:styleId="TableCaption" w:type="paragraph">
     <w:name w:val="Table Caption"/>
     <w:basedOn w:val="Caption"/>
     <w:pPr>
       <w:keepNext/>
     </w:pPr>
   </w:style>
-  <w:style w:type="paragraph" w:customStyle="1" w:styleId="ImageCaption">
+  <w:style w:customStyle="1" w:styleId="ImageCaption" w:type="paragraph">
     <w:name w:val="Image Caption"/>
     <w:basedOn w:val="Caption"/>
   </w:style>
-  <w:style w:type="paragraph" w:customStyle="1" w:styleId="Figure">
+  <w:style w:customStyle="1" w:styleId="Figure" w:type="paragraph">
     <w:name w:val="Figure"/>
     <w:basedOn w:val="Normal"/>
   </w:style>
-  <w:style w:type="paragraph" w:customStyle="1" w:styleId="CaptionedFigure">
+  <w:style w:customStyle="1" w:styleId="CaptionedFigure" w:type="paragraph">
     <w:name w:val="Captioned Figure"/>
     <w:basedOn w:val="Figure"/>
     <w:pPr>
       <w:keepNext/>
     </w:pPr>
   </w:style>
-  <w:style w:type="character" w:customStyle="1" w:styleId="CaptionChar">
-    <w:name w:val="Caption Char"/>
+  <w:style w:customStyle="1" w:styleId="BodyTextChar" w:type="character">
+    <w:name w:val="Body Text Char"/>
     <w:basedOn w:val="DefaultParagraphFont"/>
-    <w:link w:val="Caption"/>
-  </w:style>
-  <w:style w:type="character" w:customStyle="1" w:styleId="VerbatimChar">
+    <w:link w:val="BodyText"/>
+  </w:style>
+  <w:style w:customStyle="1" w:styleId="VerbatimChar" w:type="character">
     <w:name w:val="Verbatim Char"/>
-    <w:basedOn w:val="CaptionChar"/>
-    <w:link w:val="SourceCode"/>
+    <w:basedOn w:val="BodyTextChar"/>
     <w:rPr>
       <w:rFonts w:ascii="Consolas" w:hAnsi="Consolas"/>
       <w:sz w:val="22"/>
     </w:rPr>
   </w:style>
-  <w:style w:type="character" w:customStyle="1" w:styleId="SectionNumber">
+  <w:style w:customStyle="1" w:styleId="SectionNumber" w:type="character">
     <w:name w:val="Section Number"/>
-    <w:basedOn w:val="CaptionChar"/>
-  </w:style>
-  <w:style w:type="character" w:styleId="FootnoteReference">
-    <w:name w:val="footnote reference"/>
-    <w:basedOn w:val="CaptionChar"/>
+    <w:basedOn w:val="BodyTextChar"/>
+  </w:style>
+  <w:style w:styleId="FootnoteReference" w:type="character">
+    <w:name w:val="Footnote Reference"/>
+    <w:basedOn w:val="BodyTextChar"/>
     <w:rPr>
       <w:vertAlign w:val="superscript"/>
     </w:rPr>
   </w:style>
-  <w:style w:type="character" w:styleId="Hyperlink">
+  <w:style w:styleId="Hyperlink" w:type="character">
     <w:name w:val="Hyperlink"/>
-    <w:basedOn w:val="CaptionChar"/>
-    <w:rPr>
-      <w:color w:val="156082" w:themeColor="accent1"/>
-    </w:rPr>
-  </w:style>
-  <w:style w:type="paragraph" w:styleId="TOCHeading">
+    <w:basedOn w:val="BodyTextChar"/>
+    <w:rPr>
+      <w:color w:themeColor="accent1" w:val="4F81BD"/>
+    </w:rPr>
+  </w:style>
+  <w:style w:styleId="TOCHeading" w:type="paragraph">
     <w:name w:val="TOC Heading"/>
     <w:basedOn w:val="Heading1"/>
     <w:next w:val="BodyText"/>
@@ -1809,329 +1563,273 @@
       <w:spacing w:before="240" w:line="259" w:lineRule="auto"/>
       <w:outlineLvl w:val="9"/>
     </w:pPr>
+    <w:rPr>
+      <w:rFonts w:asciiTheme="majorHAnsi" w:cstheme="majorBidi" w:eastAsiaTheme="majorEastAsia" w:hAnsiTheme="majorHAnsi"/>
+      <w:b w:val="0"/>
+      <w:bCs w:val="0"/>
+      <w:color w:themeColor="accent1" w:themeShade="BF" w:val="365F91"/>
+    </w:rPr>
   </w:style>
   <w:style w:type="paragraph" w:customStyle="1" w:styleId="SourceCode">
     <w:name w:val="Source Code"/>
     <w:basedOn w:val="Normal"/>
     <w:link w:val="VerbatimChar"/>
     <w:pPr>
-      <w:shd w:val="clear" w:color="auto" w:fill="F1F3F5"/>
-      <w:wordWrap w:val="0"/>
+      <w:wordWrap w:val="off"/>
+      <w:shd w:val="clear" w:fill="f1f3f5"/>
     </w:pPr>
   </w:style>
   <w:style w:type="character" w:customStyle="1" w:styleId="KeywordTok">
     <w:name w:val="KeywordTok"/>
     <w:basedOn w:val="VerbatimChar"/>
     <w:rPr>
-      <w:rFonts w:ascii="Consolas" w:hAnsi="Consolas"/>
       <w:b/>
-      <w:color w:val="003B4F"/>
-      <w:sz w:val="22"/>
-      <w:shd w:val="clear" w:color="auto" w:fill="F1F3F5"/>
+      <w:color w:val="003b4f"/>
+      <w:shd w:val="clear" w:fill="f1f3f5"/>
     </w:rPr>
   </w:style>
   <w:style w:type="character" w:customStyle="1" w:styleId="DataTypeTok">
     <w:name w:val="DataTypeTok"/>
     <w:basedOn w:val="VerbatimChar"/>
     <w:rPr>
-      <w:rFonts w:ascii="Consolas" w:hAnsi="Consolas"/>
-      <w:color w:val="AD0000"/>
-      <w:sz w:val="22"/>
-      <w:shd w:val="clear" w:color="auto" w:fill="F1F3F5"/>
+      <w:color w:val="ad0000"/>
+      <w:shd w:val="clear" w:fill="f1f3f5"/>
     </w:rPr>
   </w:style>
   <w:style w:type="character" w:customStyle="1" w:styleId="DecValTok">
     <w:name w:val="DecValTok"/>
     <w:basedOn w:val="VerbatimChar"/>
     <w:rPr>
-      <w:rFonts w:ascii="Consolas" w:hAnsi="Consolas"/>
-      <w:color w:val="AD0000"/>
-      <w:sz w:val="22"/>
-      <w:shd w:val="clear" w:color="auto" w:fill="F1F3F5"/>
+      <w:color w:val="ad0000"/>
+      <w:shd w:val="clear" w:fill="f1f3f5"/>
     </w:rPr>
   </w:style>
   <w:style w:type="character" w:customStyle="1" w:styleId="BaseNTok">
     <w:name w:val="BaseNTok"/>
     <w:basedOn w:val="VerbatimChar"/>
     <w:rPr>
-      <w:rFonts w:ascii="Consolas" w:hAnsi="Consolas"/>
-      <w:color w:val="AD0000"/>
-      <w:sz w:val="22"/>
-      <w:shd w:val="clear" w:color="auto" w:fill="F1F3F5"/>
+      <w:color w:val="ad0000"/>
+      <w:shd w:val="clear" w:fill="f1f3f5"/>
     </w:rPr>
   </w:style>
   <w:style w:type="character" w:customStyle="1" w:styleId="FloatTok">
     <w:name w:val="FloatTok"/>
     <w:basedOn w:val="VerbatimChar"/>
     <w:rPr>
-      <w:rFonts w:ascii="Consolas" w:hAnsi="Consolas"/>
-      <w:color w:val="AD0000"/>
-      <w:sz w:val="22"/>
-      <w:shd w:val="clear" w:color="auto" w:fill="F1F3F5"/>
+      <w:color w:val="ad0000"/>
+      <w:shd w:val="clear" w:fill="f1f3f5"/>
     </w:rPr>
   </w:style>
   <w:style w:type="character" w:customStyle="1" w:styleId="ConstantTok">
     <w:name w:val="ConstantTok"/>
     <w:basedOn w:val="VerbatimChar"/>
     <w:rPr>
-      <w:rFonts w:ascii="Consolas" w:hAnsi="Consolas"/>
-      <w:color w:val="8F5902"/>
-      <w:sz w:val="22"/>
-      <w:shd w:val="clear" w:color="auto" w:fill="F1F3F5"/>
+      <w:color w:val="8f5902"/>
+      <w:shd w:val="clear" w:fill="f1f3f5"/>
     </w:rPr>
   </w:style>
   <w:style w:type="character" w:customStyle="1" w:styleId="CharTok">
     <w:name w:val="CharTok"/>
     <w:basedOn w:val="VerbatimChar"/>
     <w:rPr>
-      <w:rFonts w:ascii="Consolas" w:hAnsi="Consolas"/>
-      <w:color w:val="20794D"/>
-      <w:sz w:val="22"/>
-      <w:shd w:val="clear" w:color="auto" w:fill="F1F3F5"/>
+      <w:color w:val="20794d"/>
+      <w:shd w:val="clear" w:fill="f1f3f5"/>
     </w:rPr>
   </w:style>
   <w:style w:type="character" w:customStyle="1" w:styleId="SpecialCharTok">
     <w:name w:val="SpecialCharTok"/>
     <w:basedOn w:val="VerbatimChar"/>
     <w:rPr>
-      <w:rFonts w:ascii="Consolas" w:hAnsi="Consolas"/>
-      <w:color w:val="5E5E5E"/>
-      <w:sz w:val="22"/>
-      <w:shd w:val="clear" w:color="auto" w:fill="F1F3F5"/>
+      <w:color w:val="5e5e5e"/>
+      <w:shd w:val="clear" w:fill="f1f3f5"/>
     </w:rPr>
   </w:style>
   <w:style w:type="character" w:customStyle="1" w:styleId="StringTok">
     <w:name w:val="StringTok"/>
     <w:basedOn w:val="VerbatimChar"/>
     <w:rPr>
-      <w:rFonts w:ascii="Consolas" w:hAnsi="Consolas"/>
-      <w:color w:val="20794D"/>
-      <w:sz w:val="22"/>
-      <w:shd w:val="clear" w:color="auto" w:fill="F1F3F5"/>
+      <w:color w:val="20794d"/>
+      <w:shd w:val="clear" w:fill="f1f3f5"/>
     </w:rPr>
   </w:style>
   <w:style w:type="character" w:customStyle="1" w:styleId="VerbatimStringTok">
     <w:name w:val="VerbatimStringTok"/>
     <w:basedOn w:val="VerbatimChar"/>
     <w:rPr>
-      <w:rFonts w:ascii="Consolas" w:hAnsi="Consolas"/>
-      <w:color w:val="20794D"/>
-      <w:sz w:val="22"/>
-      <w:shd w:val="clear" w:color="auto" w:fill="F1F3F5"/>
+      <w:color w:val="20794d"/>
+      <w:shd w:val="clear" w:fill="f1f3f5"/>
     </w:rPr>
   </w:style>
   <w:style w:type="character" w:customStyle="1" w:styleId="SpecialStringTok">
     <w:name w:val="SpecialStringTok"/>
     <w:basedOn w:val="VerbatimChar"/>
     <w:rPr>
-      <w:rFonts w:ascii="Consolas" w:hAnsi="Consolas"/>
-      <w:color w:val="20794D"/>
-      <w:sz w:val="22"/>
-      <w:shd w:val="clear" w:color="auto" w:fill="F1F3F5"/>
+      <w:color w:val="20794d"/>
+      <w:shd w:val="clear" w:fill="f1f3f5"/>
     </w:rPr>
   </w:style>
   <w:style w:type="character" w:customStyle="1" w:styleId="ImportTok">
     <w:name w:val="ImportTok"/>
     <w:basedOn w:val="VerbatimChar"/>
     <w:rPr>
-      <w:rFonts w:ascii="Consolas" w:hAnsi="Consolas"/>
-      <w:color w:val="00769E"/>
-      <w:sz w:val="22"/>
-      <w:shd w:val="clear" w:color="auto" w:fill="F1F3F5"/>
+      <w:color w:val="00769e"/>
+      <w:shd w:val="clear" w:fill="f1f3f5"/>
     </w:rPr>
   </w:style>
   <w:style w:type="character" w:customStyle="1" w:styleId="CommentTok">
     <w:name w:val="CommentTok"/>
     <w:basedOn w:val="VerbatimChar"/>
     <w:rPr>
-      <w:rFonts w:ascii="Consolas" w:hAnsi="Consolas"/>
-      <w:color w:val="5E5E5E"/>
-      <w:sz w:val="22"/>
-      <w:shd w:val="clear" w:color="auto" w:fill="F1F3F5"/>
+      <w:color w:val="5e5e5e"/>
+      <w:shd w:val="clear" w:fill="f1f3f5"/>
     </w:rPr>
   </w:style>
   <w:style w:type="character" w:customStyle="1" w:styleId="DocumentationTok">
     <w:name w:val="DocumentationTok"/>
     <w:basedOn w:val="VerbatimChar"/>
     <w:rPr>
-      <w:rFonts w:ascii="Consolas" w:hAnsi="Consolas"/>
       <w:i/>
-      <w:color w:val="5E5E5E"/>
-      <w:sz w:val="22"/>
-      <w:shd w:val="clear" w:color="auto" w:fill="F1F3F5"/>
+      <w:color w:val="5e5e5e"/>
+      <w:shd w:val="clear" w:fill="f1f3f5"/>
     </w:rPr>
   </w:style>
   <w:style w:type="character" w:customStyle="1" w:styleId="AnnotationTok">
     <w:name w:val="AnnotationTok"/>
     <w:basedOn w:val="VerbatimChar"/>
     <w:rPr>
-      <w:rFonts w:ascii="Consolas" w:hAnsi="Consolas"/>
-      <w:color w:val="5E5E5E"/>
-      <w:sz w:val="22"/>
-      <w:shd w:val="clear" w:color="auto" w:fill="F1F3F5"/>
+      <w:color w:val="5e5e5e"/>
+      <w:shd w:val="clear" w:fill="f1f3f5"/>
     </w:rPr>
   </w:style>
   <w:style w:type="character" w:customStyle="1" w:styleId="CommentVarTok">
     <w:name w:val="CommentVarTok"/>
     <w:basedOn w:val="VerbatimChar"/>
     <w:rPr>
-      <w:rFonts w:ascii="Consolas" w:hAnsi="Consolas"/>
       <w:i/>
-      <w:color w:val="5E5E5E"/>
-      <w:sz w:val="22"/>
-      <w:shd w:val="clear" w:color="auto" w:fill="F1F3F5"/>
+      <w:color w:val="5e5e5e"/>
+      <w:shd w:val="clear" w:fill="f1f3f5"/>
     </w:rPr>
   </w:style>
   <w:style w:type="character" w:customStyle="1" w:styleId="OtherTok">
     <w:name w:val="OtherTok"/>
     <w:basedOn w:val="VerbatimChar"/>
     <w:rPr>
-      <w:rFonts w:ascii="Consolas" w:hAnsi="Consolas"/>
-      <w:color w:val="003B4F"/>
-      <w:sz w:val="22"/>
-      <w:shd w:val="clear" w:color="auto" w:fill="F1F3F5"/>
+      <w:color w:val="003b4f"/>
+      <w:shd w:val="clear" w:fill="f1f3f5"/>
     </w:rPr>
   </w:style>
   <w:style w:type="character" w:customStyle="1" w:styleId="FunctionTok">
     <w:name w:val="FunctionTok"/>
     <w:basedOn w:val="VerbatimChar"/>
     <w:rPr>
-      <w:rFonts w:ascii="Consolas" w:hAnsi="Consolas"/>
-      <w:color w:val="4758AB"/>
-      <w:sz w:val="22"/>
-      <w:shd w:val="clear" w:color="auto" w:fill="F1F3F5"/>
+      <w:color w:val="4758ab"/>
+      <w:shd w:val="clear" w:fill="f1f3f5"/>
     </w:rPr>
   </w:style>
   <w:style w:type="character" w:customStyle="1" w:styleId="VariableTok">
     <w:name w:val="VariableTok"/>
     <w:basedOn w:val="VerbatimChar"/>
     <w:rPr>
-      <w:rFonts w:ascii="Consolas" w:hAnsi="Consolas"/>
       <w:color w:val="111111"/>
-      <w:sz w:val="22"/>
-      <w:shd w:val="clear" w:color="auto" w:fill="F1F3F5"/>
+      <w:shd w:val="clear" w:fill="f1f3f5"/>
     </w:rPr>
   </w:style>
   <w:style w:type="character" w:customStyle="1" w:styleId="ControlFlowTok">
     <w:name w:val="ControlFlowTok"/>
     <w:basedOn w:val="VerbatimChar"/>
     <w:rPr>
-      <w:rFonts w:ascii="Consolas" w:hAnsi="Consolas"/>
       <w:b/>
-      <w:color w:val="003B4F"/>
-      <w:sz w:val="22"/>
-      <w:shd w:val="clear" w:color="auto" w:fill="F1F3F5"/>
+      <w:color w:val="003b4f"/>
+      <w:shd w:val="clear" w:fill="f1f3f5"/>
     </w:rPr>
   </w:style>
   <w:style w:type="character" w:customStyle="1" w:styleId="OperatorTok">
     <w:name w:val="OperatorTok"/>
     <w:basedOn w:val="VerbatimChar"/>
     <w:rPr>
-      <w:rFonts w:ascii="Consolas" w:hAnsi="Consolas"/>
-      <w:color w:val="5E5E5E"/>
-      <w:sz w:val="22"/>
-      <w:shd w:val="clear" w:color="auto" w:fill="F1F3F5"/>
+      <w:color w:val="5e5e5e"/>
+      <w:shd w:val="clear" w:fill="f1f3f5"/>
     </w:rPr>
   </w:style>
   <w:style w:type="character" w:customStyle="1" w:styleId="BuiltInTok">
     <w:name w:val="BuiltInTok"/>
     <w:basedOn w:val="VerbatimChar"/>
     <w:rPr>
-      <w:rFonts w:ascii="Consolas" w:hAnsi="Consolas"/>
-      <w:color w:val="003B4F"/>
-      <w:sz w:val="22"/>
-      <w:shd w:val="clear" w:color="auto" w:fill="F1F3F5"/>
+      <w:color w:val="003b4f"/>
+      <w:shd w:val="clear" w:fill="f1f3f5"/>
     </w:rPr>
   </w:style>
   <w:style w:type="character" w:customStyle="1" w:styleId="ExtensionTok">
     <w:name w:val="ExtensionTok"/>
     <w:basedOn w:val="VerbatimChar"/>
     <w:rPr>
-      <w:rFonts w:ascii="Consolas" w:hAnsi="Consolas"/>
-      <w:color w:val="003B4F"/>
-      <w:sz w:val="22"/>
-      <w:shd w:val="clear" w:color="auto" w:fill="F1F3F5"/>
+      <w:color w:val="003b4f"/>
+      <w:shd w:val="clear" w:fill="f1f3f5"/>
     </w:rPr>
   </w:style>
   <w:style w:type="character" w:customStyle="1" w:styleId="PreprocessorTok">
     <w:name w:val="PreprocessorTok"/>
     <w:basedOn w:val="VerbatimChar"/>
     <w:rPr>
-      <w:rFonts w:ascii="Consolas" w:hAnsi="Consolas"/>
-      <w:color w:val="AD0000"/>
-      <w:sz w:val="22"/>
-      <w:shd w:val="clear" w:color="auto" w:fill="F1F3F5"/>
+      <w:color w:val="ad0000"/>
+      <w:shd w:val="clear" w:fill="f1f3f5"/>
     </w:rPr>
   </w:style>
   <w:style w:type="character" w:customStyle="1" w:styleId="AttributeTok">
     <w:name w:val="AttributeTok"/>
     <w:basedOn w:val="VerbatimChar"/>
     <w:rPr>
-      <w:rFonts w:ascii="Consolas" w:hAnsi="Consolas"/>
       <w:color w:val="657422"/>
-      <w:sz w:val="22"/>
-      <w:shd w:val="clear" w:color="auto" w:fill="F1F3F5"/>
+      <w:shd w:val="clear" w:fill="f1f3f5"/>
     </w:rPr>
   </w:style>
   <w:style w:type="character" w:customStyle="1" w:styleId="RegionMarkerTok">
     <w:name w:val="RegionMarkerTok"/>
     <w:basedOn w:val="VerbatimChar"/>
     <w:rPr>
-      <w:rFonts w:ascii="Consolas" w:hAnsi="Consolas"/>
-      <w:color w:val="003B4F"/>
-      <w:sz w:val="22"/>
-      <w:shd w:val="clear" w:color="auto" w:fill="F1F3F5"/>
+      <w:color w:val="003b4f"/>
+      <w:shd w:val="clear" w:fill="f1f3f5"/>
     </w:rPr>
   </w:style>
   <w:style w:type="character" w:customStyle="1" w:styleId="InformationTok">
     <w:name w:val="InformationTok"/>
     <w:basedOn w:val="VerbatimChar"/>
     <w:rPr>
-      <w:rFonts w:ascii="Consolas" w:hAnsi="Consolas"/>
-      <w:color w:val="5E5E5E"/>
-      <w:sz w:val="22"/>
-      <w:shd w:val="clear" w:color="auto" w:fill="F1F3F5"/>
+      <w:color w:val="5e5e5e"/>
+      <w:shd w:val="clear" w:fill="f1f3f5"/>
     </w:rPr>
   </w:style>
   <w:style w:type="character" w:customStyle="1" w:styleId="WarningTok">
     <w:name w:val="WarningTok"/>
     <w:basedOn w:val="VerbatimChar"/>
     <w:rPr>
-      <w:rFonts w:ascii="Consolas" w:hAnsi="Consolas"/>
       <w:i/>
-      <w:color w:val="5E5E5E"/>
-      <w:sz w:val="22"/>
-      <w:shd w:val="clear" w:color="auto" w:fill="F1F3F5"/>
+      <w:color w:val="5e5e5e"/>
+      <w:shd w:val="clear" w:fill="f1f3f5"/>
     </w:rPr>
   </w:style>
   <w:style w:type="character" w:customStyle="1" w:styleId="AlertTok">
     <w:name w:val="AlertTok"/>
     <w:basedOn w:val="VerbatimChar"/>
     <w:rPr>
-      <w:rFonts w:ascii="Consolas" w:hAnsi="Consolas"/>
-      <w:color w:val="AD0000"/>
-      <w:sz w:val="22"/>
-      <w:shd w:val="clear" w:color="auto" w:fill="F1F3F5"/>
+      <w:color w:val="ad0000"/>
+      <w:shd w:val="clear" w:fill="f1f3f5"/>
     </w:rPr>
   </w:style>
   <w:style w:type="character" w:customStyle="1" w:styleId="ErrorTok">
     <w:name w:val="ErrorTok"/>
     <w:basedOn w:val="VerbatimChar"/>
     <w:rPr>
-      <w:rFonts w:ascii="Consolas" w:hAnsi="Consolas"/>
-      <w:color w:val="AD0000"/>
-      <w:sz w:val="22"/>
-      <w:shd w:val="clear" w:color="auto" w:fill="F1F3F5"/>
+      <w:color w:val="ad0000"/>
+      <w:shd w:val="clear" w:fill="f1f3f5"/>
     </w:rPr>
   </w:style>
   <w:style w:type="character" w:customStyle="1" w:styleId="NormalTok">
     <w:name w:val="NormalTok"/>
     <w:basedOn w:val="VerbatimChar"/>
     <w:rPr>
-      <w:rFonts w:ascii="Consolas" w:hAnsi="Consolas"/>
-      <w:color w:val="003B4F"/>
-      <w:sz w:val="22"/>
-      <w:shd w:val="clear" w:color="auto" w:fill="F1F3F5"/>
+      <w:color w:val="003b4f"/>
+      <w:shd w:val="clear" w:fill="f1f3f5"/>
     </w:rPr>
   </w:style>
 </w:styles>

</xml_diff>

<commit_message>
updated code to create 12mo moving average and corridor comparrision
</commit_message>
<xml_diff>
--- a/output/releases/2026-05_compass_lens.docx
+++ b/output/releases/2026-05_compass_lens.docx
@@ -426,7 +426,7 @@
         <w:t xml:space="preserve"> </w:t>
       </w:r>
       <w:r>
-        <w:t xml:space="preserve">Washtenaw County’s labor force growth has outpaced the other counties up until Septemer 2025 when it experienced a downturn. Estimates in May 2026 shows the labor force has increased marginally and resumes tracking the progress in neighboring counties in the OWL Corridor.</w:t>
+        <w:t xml:space="preserve">Washtenaw County’s labor force expansion significantly outpaced the broader corridor through late 2025 before undergoing a sharp cyclical contraction. As of May 2026, Washtenaw’s 12-month moving average has largely re-aligned with neighboring Oakland and Livingston counties—suggesting the regional labor supply pool is returning to macro parity after a multi-year volatility cycle.</w:t>
       </w:r>
     </w:p>
     <w:p>
@@ -473,7 +473,7 @@
           <w:i/>
           <w:iCs/>
         </w:rPr>
-        <w:t xml:space="preserve">Metrics reflect official LAUS/BLS benchmarks as of July 25, 2026. Historical series incorporate all revised estimates released through May 2026. In October 2025, a lapse in federal funding prohibited the collection of LAUS data. There is no LAUS data for October 2025.</w:t>
+        <w:t xml:space="preserve">Metrics reflect official LAUS/BLS benchmarks as of July 26, 2026. Historical series incorporate all revised estimates released through May 2026. In October 2025, a lapse in federal funding prohibited the collection of LAUS data. There is no LAUS data for October 2025.</w:t>
       </w:r>
     </w:p>
     <w:p>

</xml_diff>